<commit_message>
docs: revised python and readjusted
</commit_message>
<xml_diff>
--- a/python/data_science_libraries/python4_numpy_essentails.docx
+++ b/python/data_science_libraries/python4_numpy_essentails.docx
@@ -6,20 +6,20 @@
       <w:pPr>
         <w:jc w:val="center"/>
         <w:rPr>
-          <w:rFonts w:ascii="Carlito" w:hAnsi="Carlito" w:cs="Carlito"/>
-          <w:b/>
-          <w:bCs/>
-          <w:sz w:val="42"/>
-          <w:szCs w:val="42"/>
-        </w:rPr>
-      </w:pPr>
-      <w:r>
-        <w:rPr>
-          <w:rFonts w:ascii="Carlito" w:hAnsi="Carlito" w:cs="Carlito"/>
-          <w:b/>
-          <w:bCs/>
-          <w:sz w:val="42"/>
-          <w:szCs w:val="42"/>
+          <w:rFonts w:cs="Carlito"/>
+          <w:b/>
+          <w:bCs/>
+          <w:sz w:val="40"/>
+          <w:szCs w:val="40"/>
+        </w:rPr>
+      </w:pPr>
+      <w:r>
+        <w:rPr>
+          <w:rFonts w:cs="Carlito"/>
+          <w:b/>
+          <w:bCs/>
+          <w:sz w:val="40"/>
+          <w:szCs w:val="40"/>
         </w:rPr>
         <w:t>INDEX</w:t>
       </w:r>
@@ -27,16 +27,16 @@
     <w:p>
       <w:pPr>
         <w:rPr>
-          <w:rFonts w:ascii="Carlito" w:hAnsi="Carlito" w:cs="Carlito"/>
-          <w:sz w:val="34"/>
-          <w:szCs w:val="34"/>
-        </w:rPr>
-      </w:pPr>
-      <w:r>
-        <w:rPr>
-          <w:rFonts w:ascii="Carlito" w:hAnsi="Carlito" w:cs="Carlito"/>
-          <w:sz w:val="34"/>
-          <w:szCs w:val="34"/>
+          <w:rFonts w:cs="Carlito"/>
+          <w:sz w:val="32"/>
+          <w:szCs w:val="32"/>
+        </w:rPr>
+      </w:pPr>
+      <w:r>
+        <w:rPr>
+          <w:rFonts w:cs="Carlito"/>
+          <w:sz w:val="32"/>
+          <w:szCs w:val="32"/>
         </w:rPr>
         <w:br w:type="page"/>
       </w:r>
@@ -45,21 +45,21 @@
       <w:pPr>
         <w:jc w:val="both"/>
         <w:rPr>
-          <w:rFonts w:ascii="Carlito" w:hAnsi="Carlito" w:cs="Carlito"/>
-          <w:b/>
-          <w:bCs/>
-          <w:sz w:val="34"/>
-          <w:szCs w:val="34"/>
+          <w:rFonts w:cs="Carlito"/>
+          <w:b/>
+          <w:bCs/>
+          <w:sz w:val="32"/>
+          <w:szCs w:val="32"/>
         </w:rPr>
       </w:pPr>
       <w:proofErr w:type="spellStart"/>
       <w:r>
         <w:rPr>
-          <w:rFonts w:ascii="Carlito" w:hAnsi="Carlito" w:cs="Carlito"/>
-          <w:b/>
-          <w:bCs/>
-          <w:sz w:val="34"/>
-          <w:szCs w:val="34"/>
+          <w:rFonts w:cs="Carlito"/>
+          <w:b/>
+          <w:bCs/>
+          <w:sz w:val="32"/>
+          <w:szCs w:val="32"/>
         </w:rPr>
         <w:lastRenderedPageBreak/>
         <w:t>Numpy</w:t>
@@ -67,11 +67,11 @@
       <w:proofErr w:type="spellEnd"/>
       <w:r>
         <w:rPr>
-          <w:rFonts w:ascii="Carlito" w:hAnsi="Carlito" w:cs="Carlito"/>
-          <w:b/>
-          <w:bCs/>
-          <w:sz w:val="34"/>
-          <w:szCs w:val="34"/>
+          <w:rFonts w:cs="Carlito"/>
+          <w:b/>
+          <w:bCs/>
+          <w:sz w:val="32"/>
+          <w:szCs w:val="32"/>
         </w:rPr>
         <w:t xml:space="preserve"> Essentials:</w:t>
       </w:r>
@@ -80,20 +80,20 @@
       <w:pPr>
         <w:jc w:val="both"/>
         <w:rPr>
-          <w:rFonts w:ascii="Carlito" w:hAnsi="Carlito" w:cs="Carlito"/>
-          <w:b/>
-          <w:bCs/>
-          <w:sz w:val="34"/>
-          <w:szCs w:val="34"/>
-        </w:rPr>
-      </w:pPr>
-      <w:r>
-        <w:rPr>
-          <w:rFonts w:ascii="Carlito" w:hAnsi="Carlito" w:cs="Carlito"/>
-          <w:b/>
-          <w:bCs/>
-          <w:sz w:val="34"/>
-          <w:szCs w:val="34"/>
+          <w:rFonts w:cs="Carlito"/>
+          <w:b/>
+          <w:bCs/>
+          <w:sz w:val="32"/>
+          <w:szCs w:val="32"/>
+        </w:rPr>
+      </w:pPr>
+      <w:r>
+        <w:rPr>
+          <w:rFonts w:cs="Carlito"/>
+          <w:b/>
+          <w:bCs/>
+          <w:sz w:val="32"/>
+          <w:szCs w:val="32"/>
         </w:rPr>
         <w:t>Introduction:</w:t>
       </w:r>
@@ -102,160 +102,160 @@
       <w:pPr>
         <w:jc w:val="both"/>
         <w:rPr>
-          <w:rFonts w:ascii="Carlito" w:hAnsi="Carlito" w:cs="Carlito"/>
-          <w:sz w:val="34"/>
-          <w:szCs w:val="34"/>
-        </w:rPr>
-      </w:pPr>
-      <w:r>
-        <w:rPr>
-          <w:rFonts w:ascii="Carlito" w:hAnsi="Carlito" w:cs="Carlito"/>
-          <w:sz w:val="34"/>
-          <w:szCs w:val="34"/>
+          <w:rFonts w:cs="Carlito"/>
+          <w:sz w:val="32"/>
+          <w:szCs w:val="32"/>
+        </w:rPr>
+      </w:pPr>
+      <w:r>
+        <w:rPr>
+          <w:rFonts w:cs="Carlito"/>
+          <w:sz w:val="32"/>
+          <w:szCs w:val="32"/>
         </w:rPr>
         <w:t xml:space="preserve"># NumPy introduces a special data structure called the </w:t>
       </w:r>
       <w:r>
         <w:rPr>
-          <w:rFonts w:ascii="Carlito" w:hAnsi="Carlito" w:cs="Carlito"/>
-          <w:b/>
-          <w:bCs/>
-          <w:sz w:val="34"/>
-          <w:szCs w:val="34"/>
+          <w:rFonts w:cs="Carlito"/>
+          <w:b/>
+          <w:bCs/>
+          <w:sz w:val="32"/>
+          <w:szCs w:val="32"/>
         </w:rPr>
         <w:t>N-dimensional array</w:t>
       </w:r>
       <w:r>
         <w:rPr>
-          <w:rFonts w:ascii="Carlito" w:hAnsi="Carlito" w:cs="Carlito"/>
-          <w:sz w:val="34"/>
-          <w:szCs w:val="34"/>
+          <w:rFonts w:cs="Carlito"/>
+          <w:sz w:val="32"/>
+          <w:szCs w:val="32"/>
         </w:rPr>
         <w:t xml:space="preserve">, or </w:t>
       </w:r>
       <w:proofErr w:type="spellStart"/>
       <w:r>
         <w:rPr>
-          <w:rFonts w:ascii="Carlito" w:hAnsi="Carlito" w:cs="Carlito"/>
-          <w:b/>
-          <w:bCs/>
-          <w:sz w:val="34"/>
-          <w:szCs w:val="34"/>
+          <w:rFonts w:cs="Carlito"/>
+          <w:b/>
+          <w:bCs/>
+          <w:sz w:val="32"/>
+          <w:szCs w:val="32"/>
         </w:rPr>
         <w:t>ndarray</w:t>
       </w:r>
       <w:proofErr w:type="spellEnd"/>
       <w:r>
         <w:rPr>
-          <w:rFonts w:ascii="Carlito" w:hAnsi="Carlito" w:cs="Carlito"/>
-          <w:sz w:val="34"/>
-          <w:szCs w:val="34"/>
+          <w:rFonts w:cs="Carlito"/>
+          <w:sz w:val="32"/>
+          <w:szCs w:val="32"/>
         </w:rPr>
         <w:t>. It’s like a list, but</w:t>
       </w:r>
       <w:r>
         <w:rPr>
-          <w:rFonts w:ascii="Carlito" w:hAnsi="Carlito" w:cs="Carlito"/>
-          <w:sz w:val="34"/>
-          <w:szCs w:val="34"/>
+          <w:rFonts w:cs="Carlito"/>
+          <w:sz w:val="32"/>
+          <w:szCs w:val="32"/>
         </w:rPr>
         <w:t xml:space="preserve"> m</w:t>
       </w:r>
       <w:r>
         <w:rPr>
-          <w:rFonts w:ascii="Carlito" w:hAnsi="Carlito" w:cs="Carlito"/>
-          <w:sz w:val="34"/>
-          <w:szCs w:val="34"/>
+          <w:rFonts w:cs="Carlito"/>
+          <w:sz w:val="32"/>
+          <w:szCs w:val="32"/>
         </w:rPr>
         <w:t>ore compact in memory</w:t>
       </w:r>
       <w:r>
         <w:rPr>
-          <w:rFonts w:ascii="Carlito" w:hAnsi="Carlito" w:cs="Carlito"/>
-          <w:sz w:val="34"/>
-          <w:szCs w:val="34"/>
+          <w:rFonts w:cs="Carlito"/>
+          <w:sz w:val="32"/>
+          <w:szCs w:val="32"/>
         </w:rPr>
         <w:t>, m</w:t>
       </w:r>
       <w:r>
         <w:rPr>
-          <w:rFonts w:ascii="Carlito" w:hAnsi="Carlito" w:cs="Carlito"/>
-          <w:sz w:val="34"/>
-          <w:szCs w:val="34"/>
+          <w:rFonts w:cs="Carlito"/>
+          <w:sz w:val="32"/>
+          <w:szCs w:val="32"/>
         </w:rPr>
         <w:t>uch faster for numerical operations</w:t>
       </w:r>
       <w:r>
         <w:rPr>
-          <w:rFonts w:ascii="Carlito" w:hAnsi="Carlito" w:cs="Carlito"/>
-          <w:sz w:val="34"/>
-          <w:szCs w:val="34"/>
+          <w:rFonts w:cs="Carlito"/>
+          <w:sz w:val="32"/>
+          <w:szCs w:val="32"/>
         </w:rPr>
         <w:t xml:space="preserve"> </w:t>
       </w:r>
       <w:r>
         <w:rPr>
-          <w:rFonts w:ascii="Carlito" w:hAnsi="Carlito" w:cs="Carlito"/>
-          <w:sz w:val="34"/>
-          <w:szCs w:val="34"/>
+          <w:rFonts w:cs="Carlito"/>
+          <w:sz w:val="32"/>
+          <w:szCs w:val="32"/>
         </w:rPr>
         <w:t>and c</w:t>
       </w:r>
       <w:r>
         <w:rPr>
-          <w:rFonts w:ascii="Carlito" w:hAnsi="Carlito" w:cs="Carlito"/>
-          <w:sz w:val="34"/>
-          <w:szCs w:val="34"/>
+          <w:rFonts w:cs="Carlito"/>
+          <w:sz w:val="32"/>
+          <w:szCs w:val="32"/>
         </w:rPr>
         <w:t>an handle multi-dimensional data (like matrices)</w:t>
       </w:r>
       <w:r>
         <w:rPr>
-          <w:rFonts w:ascii="Carlito" w:hAnsi="Carlito" w:cs="Carlito"/>
-          <w:sz w:val="34"/>
-          <w:szCs w:val="34"/>
+          <w:rFonts w:cs="Carlito"/>
+          <w:sz w:val="32"/>
+          <w:szCs w:val="32"/>
         </w:rPr>
         <w:t>.</w:t>
       </w:r>
       <w:r>
         <w:rPr>
-          <w:rFonts w:ascii="Carlito" w:hAnsi="Carlito" w:cs="Carlito"/>
-          <w:sz w:val="34"/>
-          <w:szCs w:val="34"/>
+          <w:rFonts w:cs="Carlito"/>
+          <w:sz w:val="32"/>
+          <w:szCs w:val="32"/>
         </w:rPr>
         <w:t xml:space="preserve"> Python lists store elements separately in memory, while </w:t>
       </w:r>
       <w:r>
         <w:rPr>
-          <w:rFonts w:ascii="Carlito" w:hAnsi="Carlito" w:cs="Carlito"/>
-          <w:b/>
-          <w:bCs/>
-          <w:sz w:val="34"/>
-          <w:szCs w:val="34"/>
+          <w:rFonts w:cs="Carlito"/>
+          <w:b/>
+          <w:bCs/>
+          <w:sz w:val="32"/>
+          <w:szCs w:val="32"/>
         </w:rPr>
         <w:t>NumPy</w:t>
       </w:r>
       <w:r>
         <w:rPr>
-          <w:rFonts w:ascii="Carlito" w:hAnsi="Carlito" w:cs="Carlito"/>
-          <w:sz w:val="34"/>
-          <w:szCs w:val="34"/>
+          <w:rFonts w:cs="Carlito"/>
+          <w:sz w:val="32"/>
+          <w:szCs w:val="32"/>
         </w:rPr>
         <w:t xml:space="preserve"> arrays store them in contiguous memory blocks allowing vectorized operations (done at C-speed </w:t>
       </w:r>
       <w:r>
         <w:rPr>
           <w:rFonts w:ascii="Segoe UI Emoji" w:hAnsi="Segoe UI Emoji" w:cs="Segoe UI Emoji"/>
-          <w:sz w:val="34"/>
-          <w:szCs w:val="34"/>
+          <w:sz w:val="32"/>
+          <w:szCs w:val="32"/>
         </w:rPr>
         <w:t>🚀</w:t>
       </w:r>
       <w:r>
         <w:rPr>
-          <w:rFonts w:ascii="Carlito" w:hAnsi="Carlito" w:cs="Carlito"/>
-          <w:sz w:val="34"/>
-          <w:szCs w:val="34"/>
+          <w:rFonts w:cs="Carlito"/>
+          <w:sz w:val="32"/>
+          <w:szCs w:val="32"/>
         </w:rPr>
         <w:t>).</w:t>
       </w:r>
@@ -264,40 +264,40 @@
       <w:pPr>
         <w:jc w:val="both"/>
         <w:rPr>
-          <w:rFonts w:ascii="Carlito" w:hAnsi="Carlito" w:cs="Carlito"/>
-          <w:sz w:val="34"/>
-          <w:szCs w:val="34"/>
-        </w:rPr>
-      </w:pPr>
-    </w:p>
-    <w:p>
-      <w:pPr>
-        <w:jc w:val="both"/>
-        <w:rPr>
-          <w:rFonts w:ascii="Carlito" w:hAnsi="Carlito" w:cs="Carlito"/>
-          <w:b/>
-          <w:bCs/>
-          <w:sz w:val="34"/>
-          <w:szCs w:val="34"/>
-        </w:rPr>
-      </w:pPr>
-      <w:r>
-        <w:rPr>
-          <w:rFonts w:ascii="Carlito" w:hAnsi="Carlito" w:cs="Carlito"/>
-          <w:b/>
-          <w:bCs/>
-          <w:sz w:val="34"/>
-          <w:szCs w:val="34"/>
+          <w:rFonts w:cs="Carlito"/>
+          <w:sz w:val="32"/>
+          <w:szCs w:val="32"/>
+        </w:rPr>
+      </w:pPr>
+    </w:p>
+    <w:p>
+      <w:pPr>
+        <w:jc w:val="both"/>
+        <w:rPr>
+          <w:rFonts w:cs="Carlito"/>
+          <w:b/>
+          <w:bCs/>
+          <w:sz w:val="32"/>
+          <w:szCs w:val="32"/>
+        </w:rPr>
+      </w:pPr>
+      <w:r>
+        <w:rPr>
+          <w:rFonts w:cs="Carlito"/>
+          <w:b/>
+          <w:bCs/>
+          <w:sz w:val="32"/>
+          <w:szCs w:val="32"/>
         </w:rPr>
         <w:t xml:space="preserve">Computing </w:t>
       </w:r>
       <w:r>
         <w:rPr>
-          <w:rFonts w:ascii="Carlito" w:hAnsi="Carlito" w:cs="Carlito"/>
-          <w:b/>
-          <w:bCs/>
-          <w:sz w:val="34"/>
-          <w:szCs w:val="34"/>
+          <w:rFonts w:cs="Carlito"/>
+          <w:b/>
+          <w:bCs/>
+          <w:sz w:val="32"/>
+          <w:szCs w:val="32"/>
         </w:rPr>
         <w:t>Element-wise Operations:</w:t>
       </w:r>
@@ -306,24 +306,24 @@
       <w:pPr>
         <w:jc w:val="both"/>
         <w:rPr>
-          <w:rFonts w:ascii="Carlito" w:hAnsi="Carlito" w:cs="Carlito"/>
-          <w:sz w:val="34"/>
-          <w:szCs w:val="34"/>
-        </w:rPr>
-      </w:pPr>
-      <w:r>
-        <w:rPr>
-          <w:rFonts w:ascii="Carlito" w:hAnsi="Carlito" w:cs="Carlito"/>
-          <w:sz w:val="34"/>
-          <w:szCs w:val="34"/>
+          <w:rFonts w:cs="Carlito"/>
+          <w:sz w:val="32"/>
+          <w:szCs w:val="32"/>
+        </w:rPr>
+      </w:pPr>
+      <w:r>
+        <w:rPr>
+          <w:rFonts w:cs="Carlito"/>
+          <w:sz w:val="32"/>
+          <w:szCs w:val="32"/>
         </w:rPr>
         <w:t>#</w:t>
       </w:r>
       <w:r>
         <w:rPr>
-          <w:rFonts w:ascii="Carlito" w:hAnsi="Carlito" w:cs="Carlito"/>
-          <w:sz w:val="34"/>
-          <w:szCs w:val="34"/>
+          <w:rFonts w:cs="Carlito"/>
+          <w:sz w:val="32"/>
+          <w:szCs w:val="32"/>
         </w:rPr>
         <w:t xml:space="preserve"> Element-wise operations mean performing a mathematical operation on each element of an array individually, instead of looping through it manually. Each operation is applied to every corresponding element in both arrays automatically, without using any for loop.</w:t>
       </w:r>
@@ -332,46 +332,46 @@
       <w:pPr>
         <w:jc w:val="both"/>
         <w:rPr>
-          <w:rFonts w:ascii="Carlito" w:hAnsi="Carlito" w:cs="Carlito"/>
-          <w:b/>
-          <w:bCs/>
-          <w:color w:val="D86DCB" w:themeColor="accent5" w:themeTint="99"/>
-          <w:sz w:val="34"/>
-          <w:szCs w:val="34"/>
-        </w:rPr>
-      </w:pPr>
-      <w:r>
-        <w:rPr>
-          <w:rFonts w:ascii="Carlito" w:hAnsi="Carlito" w:cs="Carlito"/>
-          <w:b/>
-          <w:bCs/>
-          <w:color w:val="D86DCB" w:themeColor="accent5" w:themeTint="99"/>
-          <w:sz w:val="34"/>
-          <w:szCs w:val="34"/>
+          <w:rFonts w:cs="Carlito"/>
+          <w:b/>
+          <w:bCs/>
+          <w:color w:val="D86DCB" w:themeColor="accent5" w:themeTint="99"/>
+          <w:sz w:val="32"/>
+          <w:szCs w:val="32"/>
+        </w:rPr>
+      </w:pPr>
+      <w:r>
+        <w:rPr>
+          <w:rFonts w:cs="Carlito"/>
+          <w:b/>
+          <w:bCs/>
+          <w:color w:val="D86DCB" w:themeColor="accent5" w:themeTint="99"/>
+          <w:sz w:val="32"/>
+          <w:szCs w:val="32"/>
         </w:rPr>
         <w:t xml:space="preserve">import </w:t>
       </w:r>
       <w:proofErr w:type="spellStart"/>
       <w:r>
         <w:rPr>
-          <w:rFonts w:ascii="Carlito" w:hAnsi="Carlito" w:cs="Carlito"/>
-          <w:b/>
-          <w:bCs/>
-          <w:color w:val="D86DCB" w:themeColor="accent5" w:themeTint="99"/>
-          <w:sz w:val="34"/>
-          <w:szCs w:val="34"/>
+          <w:rFonts w:cs="Carlito"/>
+          <w:b/>
+          <w:bCs/>
+          <w:color w:val="D86DCB" w:themeColor="accent5" w:themeTint="99"/>
+          <w:sz w:val="32"/>
+          <w:szCs w:val="32"/>
         </w:rPr>
         <w:t>numpy</w:t>
       </w:r>
       <w:proofErr w:type="spellEnd"/>
       <w:r>
         <w:rPr>
-          <w:rFonts w:ascii="Carlito" w:hAnsi="Carlito" w:cs="Carlito"/>
-          <w:b/>
-          <w:bCs/>
-          <w:color w:val="D86DCB" w:themeColor="accent5" w:themeTint="99"/>
-          <w:sz w:val="34"/>
-          <w:szCs w:val="34"/>
+          <w:rFonts w:cs="Carlito"/>
+          <w:b/>
+          <w:bCs/>
+          <w:color w:val="D86DCB" w:themeColor="accent5" w:themeTint="99"/>
+          <w:sz w:val="32"/>
+          <w:szCs w:val="32"/>
         </w:rPr>
         <w:t xml:space="preserve"> as np</w:t>
       </w:r>
@@ -380,22 +380,22 @@
       <w:pPr>
         <w:jc w:val="both"/>
         <w:rPr>
-          <w:rFonts w:ascii="Carlito" w:hAnsi="Carlito" w:cs="Carlito"/>
-          <w:b/>
-          <w:bCs/>
-          <w:color w:val="D86DCB" w:themeColor="accent5" w:themeTint="99"/>
-          <w:sz w:val="34"/>
-          <w:szCs w:val="34"/>
-        </w:rPr>
-      </w:pPr>
-      <w:r>
-        <w:rPr>
-          <w:rFonts w:ascii="Carlito" w:hAnsi="Carlito" w:cs="Carlito"/>
-          <w:b/>
-          <w:bCs/>
-          <w:color w:val="D86DCB" w:themeColor="accent5" w:themeTint="99"/>
-          <w:sz w:val="34"/>
-          <w:szCs w:val="34"/>
+          <w:rFonts w:cs="Carlito"/>
+          <w:b/>
+          <w:bCs/>
+          <w:color w:val="D86DCB" w:themeColor="accent5" w:themeTint="99"/>
+          <w:sz w:val="32"/>
+          <w:szCs w:val="32"/>
+        </w:rPr>
+      </w:pPr>
+      <w:r>
+        <w:rPr>
+          <w:rFonts w:cs="Carlito"/>
+          <w:b/>
+          <w:bCs/>
+          <w:color w:val="D86DCB" w:themeColor="accent5" w:themeTint="99"/>
+          <w:sz w:val="32"/>
+          <w:szCs w:val="32"/>
         </w:rPr>
         <w:t xml:space="preserve">a = </w:t>
       </w:r>
@@ -403,12 +403,12 @@
       <w:proofErr w:type="gramStart"/>
       <w:r>
         <w:rPr>
-          <w:rFonts w:ascii="Carlito" w:hAnsi="Carlito" w:cs="Carlito"/>
-          <w:b/>
-          <w:bCs/>
-          <w:color w:val="D86DCB" w:themeColor="accent5" w:themeTint="99"/>
-          <w:sz w:val="34"/>
-          <w:szCs w:val="34"/>
+          <w:rFonts w:cs="Carlito"/>
+          <w:b/>
+          <w:bCs/>
+          <w:color w:val="D86DCB" w:themeColor="accent5" w:themeTint="99"/>
+          <w:sz w:val="32"/>
+          <w:szCs w:val="32"/>
         </w:rPr>
         <w:t>np.array</w:t>
       </w:r>
@@ -416,12 +416,12 @@
       <w:proofErr w:type="gramEnd"/>
       <w:r>
         <w:rPr>
-          <w:rFonts w:ascii="Carlito" w:hAnsi="Carlito" w:cs="Carlito"/>
-          <w:b/>
-          <w:bCs/>
-          <w:color w:val="D86DCB" w:themeColor="accent5" w:themeTint="99"/>
-          <w:sz w:val="34"/>
-          <w:szCs w:val="34"/>
+          <w:rFonts w:cs="Carlito"/>
+          <w:b/>
+          <w:bCs/>
+          <w:color w:val="D86DCB" w:themeColor="accent5" w:themeTint="99"/>
+          <w:sz w:val="32"/>
+          <w:szCs w:val="32"/>
         </w:rPr>
         <w:t>([1,2,3,4])</w:t>
       </w:r>
@@ -430,22 +430,22 @@
       <w:pPr>
         <w:jc w:val="both"/>
         <w:rPr>
-          <w:rFonts w:ascii="Carlito" w:hAnsi="Carlito" w:cs="Carlito"/>
-          <w:b/>
-          <w:bCs/>
-          <w:color w:val="D86DCB" w:themeColor="accent5" w:themeTint="99"/>
-          <w:sz w:val="34"/>
-          <w:szCs w:val="34"/>
-        </w:rPr>
-      </w:pPr>
-      <w:r>
-        <w:rPr>
-          <w:rFonts w:ascii="Carlito" w:hAnsi="Carlito" w:cs="Carlito"/>
-          <w:b/>
-          <w:bCs/>
-          <w:color w:val="D86DCB" w:themeColor="accent5" w:themeTint="99"/>
-          <w:sz w:val="34"/>
-          <w:szCs w:val="34"/>
+          <w:rFonts w:cs="Carlito"/>
+          <w:b/>
+          <w:bCs/>
+          <w:color w:val="D86DCB" w:themeColor="accent5" w:themeTint="99"/>
+          <w:sz w:val="32"/>
+          <w:szCs w:val="32"/>
+        </w:rPr>
+      </w:pPr>
+      <w:r>
+        <w:rPr>
+          <w:rFonts w:cs="Carlito"/>
+          <w:b/>
+          <w:bCs/>
+          <w:color w:val="D86DCB" w:themeColor="accent5" w:themeTint="99"/>
+          <w:sz w:val="32"/>
+          <w:szCs w:val="32"/>
         </w:rPr>
         <w:t xml:space="preserve">b = </w:t>
       </w:r>
@@ -453,12 +453,12 @@
       <w:proofErr w:type="gramStart"/>
       <w:r>
         <w:rPr>
-          <w:rFonts w:ascii="Carlito" w:hAnsi="Carlito" w:cs="Carlito"/>
-          <w:b/>
-          <w:bCs/>
-          <w:color w:val="D86DCB" w:themeColor="accent5" w:themeTint="99"/>
-          <w:sz w:val="34"/>
-          <w:szCs w:val="34"/>
+          <w:rFonts w:cs="Carlito"/>
+          <w:b/>
+          <w:bCs/>
+          <w:color w:val="D86DCB" w:themeColor="accent5" w:themeTint="99"/>
+          <w:sz w:val="32"/>
+          <w:szCs w:val="32"/>
         </w:rPr>
         <w:t>np.array</w:t>
       </w:r>
@@ -466,12 +466,12 @@
       <w:proofErr w:type="gramEnd"/>
       <w:r>
         <w:rPr>
-          <w:rFonts w:ascii="Carlito" w:hAnsi="Carlito" w:cs="Carlito"/>
-          <w:b/>
-          <w:bCs/>
-          <w:color w:val="D86DCB" w:themeColor="accent5" w:themeTint="99"/>
-          <w:sz w:val="34"/>
-          <w:szCs w:val="34"/>
+          <w:rFonts w:cs="Carlito"/>
+          <w:b/>
+          <w:bCs/>
+          <w:color w:val="D86DCB" w:themeColor="accent5" w:themeTint="99"/>
+          <w:sz w:val="32"/>
+          <w:szCs w:val="32"/>
         </w:rPr>
         <w:t>([5,6,7,8])</w:t>
       </w:r>
@@ -480,22 +480,22 @@
       <w:pPr>
         <w:jc w:val="both"/>
         <w:rPr>
-          <w:rFonts w:ascii="Carlito" w:hAnsi="Carlito" w:cs="Carlito"/>
-          <w:b/>
-          <w:bCs/>
-          <w:color w:val="D86DCB" w:themeColor="accent5" w:themeTint="99"/>
-          <w:sz w:val="34"/>
-          <w:szCs w:val="34"/>
-        </w:rPr>
-      </w:pPr>
-      <w:r>
-        <w:rPr>
-          <w:rFonts w:ascii="Carlito" w:hAnsi="Carlito" w:cs="Carlito"/>
-          <w:b/>
-          <w:bCs/>
-          <w:color w:val="D86DCB" w:themeColor="accent5" w:themeTint="99"/>
-          <w:sz w:val="34"/>
-          <w:szCs w:val="34"/>
+          <w:rFonts w:cs="Carlito"/>
+          <w:b/>
+          <w:bCs/>
+          <w:color w:val="D86DCB" w:themeColor="accent5" w:themeTint="99"/>
+          <w:sz w:val="32"/>
+          <w:szCs w:val="32"/>
+        </w:rPr>
+      </w:pPr>
+      <w:r>
+        <w:rPr>
+          <w:rFonts w:cs="Carlito"/>
+          <w:b/>
+          <w:bCs/>
+          <w:color w:val="D86DCB" w:themeColor="accent5" w:themeTint="99"/>
+          <w:sz w:val="32"/>
+          <w:szCs w:val="32"/>
         </w:rPr>
         <w:t>result = a + b</w:t>
       </w:r>
@@ -504,22 +504,22 @@
       <w:pPr>
         <w:jc w:val="both"/>
         <w:rPr>
-          <w:rFonts w:ascii="Carlito" w:hAnsi="Carlito" w:cs="Carlito"/>
-          <w:b/>
-          <w:bCs/>
-          <w:color w:val="D86DCB" w:themeColor="accent5" w:themeTint="99"/>
-          <w:sz w:val="34"/>
-          <w:szCs w:val="34"/>
-        </w:rPr>
-      </w:pPr>
-      <w:r>
-        <w:rPr>
-          <w:rFonts w:ascii="Carlito" w:hAnsi="Carlito" w:cs="Carlito"/>
-          <w:b/>
-          <w:bCs/>
-          <w:color w:val="D86DCB" w:themeColor="accent5" w:themeTint="99"/>
-          <w:sz w:val="34"/>
-          <w:szCs w:val="34"/>
+          <w:rFonts w:cs="Carlito"/>
+          <w:b/>
+          <w:bCs/>
+          <w:color w:val="D86DCB" w:themeColor="accent5" w:themeTint="99"/>
+          <w:sz w:val="32"/>
+          <w:szCs w:val="32"/>
+        </w:rPr>
+      </w:pPr>
+      <w:r>
+        <w:rPr>
+          <w:rFonts w:cs="Carlito"/>
+          <w:b/>
+          <w:bCs/>
+          <w:color w:val="D86DCB" w:themeColor="accent5" w:themeTint="99"/>
+          <w:sz w:val="32"/>
+          <w:szCs w:val="32"/>
         </w:rPr>
         <w:t>print(result)</w:t>
       </w:r>
@@ -528,16 +528,16 @@
       <w:pPr>
         <w:jc w:val="both"/>
         <w:rPr>
-          <w:rFonts w:ascii="Carlito" w:hAnsi="Carlito" w:cs="Carlito"/>
-          <w:sz w:val="34"/>
-          <w:szCs w:val="34"/>
-        </w:rPr>
-      </w:pPr>
-      <w:r>
-        <w:rPr>
-          <w:rFonts w:ascii="Carlito" w:hAnsi="Carlito" w:cs="Carlito"/>
-          <w:sz w:val="34"/>
-          <w:szCs w:val="34"/>
+          <w:rFonts w:cs="Carlito"/>
+          <w:sz w:val="32"/>
+          <w:szCs w:val="32"/>
+        </w:rPr>
+      </w:pPr>
+      <w:r>
+        <w:rPr>
+          <w:rFonts w:cs="Carlito"/>
+          <w:sz w:val="32"/>
+          <w:szCs w:val="32"/>
         </w:rPr>
         <w:t>Note: We can do other operations like subtraction, multiplication and division too.</w:t>
       </w:r>
@@ -546,42 +546,42 @@
       <w:pPr>
         <w:jc w:val="both"/>
         <w:rPr>
-          <w:rFonts w:ascii="Carlito" w:hAnsi="Carlito" w:cs="Carlito"/>
-          <w:b/>
-          <w:bCs/>
-          <w:sz w:val="34"/>
-          <w:szCs w:val="34"/>
-        </w:rPr>
-      </w:pPr>
-      <w:r>
-        <w:rPr>
-          <w:rFonts w:ascii="Carlito" w:hAnsi="Carlito" w:cs="Carlito"/>
-          <w:b/>
-          <w:bCs/>
-          <w:sz w:val="34"/>
-          <w:szCs w:val="34"/>
+          <w:rFonts w:cs="Carlito"/>
+          <w:b/>
+          <w:bCs/>
+          <w:sz w:val="32"/>
+          <w:szCs w:val="32"/>
+        </w:rPr>
+      </w:pPr>
+      <w:r>
+        <w:rPr>
+          <w:rFonts w:cs="Carlito"/>
+          <w:b/>
+          <w:bCs/>
+          <w:sz w:val="32"/>
+          <w:szCs w:val="32"/>
         </w:rPr>
         <w:t xml:space="preserve">Creating Sequence of Numbers using </w:t>
       </w:r>
       <w:proofErr w:type="spellStart"/>
       <w:r>
         <w:rPr>
-          <w:rFonts w:ascii="Carlito" w:hAnsi="Carlito" w:cs="Carlito"/>
-          <w:b/>
-          <w:bCs/>
-          <w:sz w:val="34"/>
-          <w:szCs w:val="34"/>
+          <w:rFonts w:cs="Carlito"/>
+          <w:b/>
+          <w:bCs/>
+          <w:sz w:val="32"/>
+          <w:szCs w:val="32"/>
         </w:rPr>
         <w:t>Numpy</w:t>
       </w:r>
       <w:proofErr w:type="spellEnd"/>
       <w:r>
         <w:rPr>
-          <w:rFonts w:ascii="Carlito" w:hAnsi="Carlito" w:cs="Carlito"/>
-          <w:b/>
-          <w:bCs/>
-          <w:sz w:val="34"/>
-          <w:szCs w:val="34"/>
+          <w:rFonts w:cs="Carlito"/>
+          <w:b/>
+          <w:bCs/>
+          <w:sz w:val="32"/>
+          <w:szCs w:val="32"/>
         </w:rPr>
         <w:t>:</w:t>
       </w:r>
@@ -590,16 +590,16 @@
       <w:pPr>
         <w:jc w:val="both"/>
         <w:rPr>
-          <w:rFonts w:ascii="Carlito" w:hAnsi="Carlito" w:cs="Carlito"/>
-          <w:sz w:val="34"/>
-          <w:szCs w:val="34"/>
-        </w:rPr>
-      </w:pPr>
-      <w:r>
-        <w:rPr>
-          <w:rFonts w:ascii="Carlito" w:hAnsi="Carlito" w:cs="Carlito"/>
-          <w:sz w:val="34"/>
-          <w:szCs w:val="34"/>
+          <w:rFonts w:cs="Carlito"/>
+          <w:sz w:val="32"/>
+          <w:szCs w:val="32"/>
+        </w:rPr>
+      </w:pPr>
+      <w:r>
+        <w:rPr>
+          <w:rFonts w:cs="Carlito"/>
+          <w:sz w:val="32"/>
+          <w:szCs w:val="32"/>
         </w:rPr>
         <w:lastRenderedPageBreak/>
         <w:t xml:space="preserve"># </w:t>
@@ -608,11 +608,11 @@
       <w:proofErr w:type="gramStart"/>
       <w:r>
         <w:rPr>
-          <w:rFonts w:ascii="Carlito" w:hAnsi="Carlito" w:cs="Carlito"/>
-          <w:b/>
-          <w:bCs/>
-          <w:sz w:val="34"/>
-          <w:szCs w:val="34"/>
+          <w:rFonts w:cs="Carlito"/>
+          <w:b/>
+          <w:bCs/>
+          <w:sz w:val="32"/>
+          <w:szCs w:val="32"/>
         </w:rPr>
         <w:t>np.arange</w:t>
       </w:r>
@@ -620,49 +620,49 @@
       <w:proofErr w:type="gramEnd"/>
       <w:r>
         <w:rPr>
-          <w:rFonts w:ascii="Carlito" w:hAnsi="Carlito" w:cs="Carlito"/>
-          <w:b/>
-          <w:bCs/>
-          <w:sz w:val="34"/>
-          <w:szCs w:val="34"/>
+          <w:rFonts w:cs="Carlito"/>
+          <w:b/>
+          <w:bCs/>
+          <w:sz w:val="32"/>
+          <w:szCs w:val="32"/>
         </w:rPr>
         <w:t>()</w:t>
       </w:r>
       <w:r>
         <w:rPr>
-          <w:rFonts w:ascii="Carlito" w:hAnsi="Carlito" w:cs="Carlito"/>
-          <w:sz w:val="34"/>
-          <w:szCs w:val="34"/>
+          <w:rFonts w:cs="Carlito"/>
+          <w:sz w:val="32"/>
+          <w:szCs w:val="32"/>
         </w:rPr>
         <w:t xml:space="preserve"> is a NumPy function that creates a sequence of numbers with a specific start, stop, and step value. Think of it like Python’s </w:t>
       </w:r>
       <w:proofErr w:type="gramStart"/>
       <w:r>
         <w:rPr>
-          <w:rFonts w:ascii="Carlito" w:hAnsi="Carlito" w:cs="Carlito"/>
-          <w:b/>
-          <w:bCs/>
-          <w:sz w:val="34"/>
-          <w:szCs w:val="34"/>
+          <w:rFonts w:cs="Carlito"/>
+          <w:b/>
+          <w:bCs/>
+          <w:sz w:val="32"/>
+          <w:szCs w:val="32"/>
         </w:rPr>
         <w:t>range(</w:t>
       </w:r>
       <w:proofErr w:type="gramEnd"/>
       <w:r>
         <w:rPr>
-          <w:rFonts w:ascii="Carlito" w:hAnsi="Carlito" w:cs="Carlito"/>
-          <w:b/>
-          <w:bCs/>
-          <w:sz w:val="34"/>
-          <w:szCs w:val="34"/>
+          <w:rFonts w:cs="Carlito"/>
+          <w:b/>
+          <w:bCs/>
+          <w:sz w:val="32"/>
+          <w:szCs w:val="32"/>
         </w:rPr>
         <w:t>)</w:t>
       </w:r>
       <w:r>
         <w:rPr>
-          <w:rFonts w:ascii="Carlito" w:hAnsi="Carlito" w:cs="Carlito"/>
-          <w:sz w:val="34"/>
-          <w:szCs w:val="34"/>
+          <w:rFonts w:cs="Carlito"/>
+          <w:sz w:val="32"/>
+          <w:szCs w:val="32"/>
         </w:rPr>
         <w:t>, but it returns a NumPy array instead of a list.</w:t>
       </w:r>
@@ -671,26 +671,26 @@
       <w:pPr>
         <w:jc w:val="both"/>
         <w:rPr>
-          <w:rFonts w:ascii="Carlito" w:hAnsi="Carlito" w:cs="Carlito"/>
-          <w:sz w:val="34"/>
-          <w:szCs w:val="34"/>
-        </w:rPr>
-      </w:pPr>
-      <w:r>
-        <w:rPr>
-          <w:rFonts w:ascii="Carlito" w:hAnsi="Carlito" w:cs="Carlito"/>
-          <w:sz w:val="34"/>
-          <w:szCs w:val="34"/>
+          <w:rFonts w:cs="Carlito"/>
+          <w:sz w:val="32"/>
+          <w:szCs w:val="32"/>
+        </w:rPr>
+      </w:pPr>
+      <w:r>
+        <w:rPr>
+          <w:rFonts w:cs="Carlito"/>
+          <w:sz w:val="32"/>
+          <w:szCs w:val="32"/>
         </w:rPr>
         <w:t># Syntax is like this</w:t>
       </w:r>
       <w:r>
         <w:rPr>
-          <w:rFonts w:ascii="Carlito" w:hAnsi="Carlito" w:cs="Carlito"/>
-          <w:b/>
-          <w:bCs/>
-          <w:sz w:val="34"/>
-          <w:szCs w:val="34"/>
+          <w:rFonts w:cs="Carlito"/>
+          <w:b/>
+          <w:bCs/>
+          <w:sz w:val="32"/>
+          <w:szCs w:val="32"/>
         </w:rPr>
         <w:t xml:space="preserve"> </w:t>
       </w:r>
@@ -698,11 +698,11 @@
       <w:proofErr w:type="gramStart"/>
       <w:r>
         <w:rPr>
-          <w:rFonts w:ascii="Carlito" w:hAnsi="Carlito" w:cs="Carlito"/>
-          <w:b/>
-          <w:bCs/>
-          <w:sz w:val="34"/>
-          <w:szCs w:val="34"/>
+          <w:rFonts w:cs="Carlito"/>
+          <w:b/>
+          <w:bCs/>
+          <w:sz w:val="32"/>
+          <w:szCs w:val="32"/>
         </w:rPr>
         <w:t>np.arange</w:t>
       </w:r>
@@ -710,19 +710,19 @@
       <w:proofErr w:type="gramEnd"/>
       <w:r>
         <w:rPr>
-          <w:rFonts w:ascii="Carlito" w:hAnsi="Carlito" w:cs="Carlito"/>
-          <w:b/>
-          <w:bCs/>
-          <w:sz w:val="34"/>
-          <w:szCs w:val="34"/>
+          <w:rFonts w:cs="Carlito"/>
+          <w:b/>
+          <w:bCs/>
+          <w:sz w:val="32"/>
+          <w:szCs w:val="32"/>
         </w:rPr>
         <w:t xml:space="preserve">(start, stop, step). </w:t>
       </w:r>
       <w:r>
         <w:rPr>
-          <w:rFonts w:ascii="Carlito" w:hAnsi="Carlito" w:cs="Carlito"/>
-          <w:sz w:val="34"/>
-          <w:szCs w:val="34"/>
+          <w:rFonts w:cs="Carlito"/>
+          <w:sz w:val="32"/>
+          <w:szCs w:val="32"/>
         </w:rPr>
         <w:t>Parameters are</w:t>
       </w:r>
@@ -736,52 +736,52 @@
         </w:numPr>
         <w:jc w:val="both"/>
         <w:rPr>
-          <w:rFonts w:ascii="Carlito" w:hAnsi="Carlito" w:cs="Carlito"/>
-          <w:sz w:val="34"/>
-          <w:szCs w:val="34"/>
-        </w:rPr>
-      </w:pPr>
-      <w:r>
-        <w:rPr>
-          <w:rFonts w:ascii="Carlito" w:hAnsi="Carlito" w:cs="Carlito"/>
-          <w:b/>
-          <w:bCs/>
-          <w:sz w:val="34"/>
-          <w:szCs w:val="34"/>
+          <w:rFonts w:cs="Carlito"/>
+          <w:sz w:val="32"/>
+          <w:szCs w:val="32"/>
+        </w:rPr>
+      </w:pPr>
+      <w:r>
+        <w:rPr>
+          <w:rFonts w:cs="Carlito"/>
+          <w:b/>
+          <w:bCs/>
+          <w:sz w:val="32"/>
+          <w:szCs w:val="32"/>
         </w:rPr>
         <w:t>start</w:t>
       </w:r>
       <w:r>
         <w:rPr>
-          <w:rFonts w:ascii="Carlito" w:hAnsi="Carlito" w:cs="Carlito"/>
-          <w:b/>
-          <w:bCs/>
-          <w:sz w:val="34"/>
-          <w:szCs w:val="34"/>
+          <w:rFonts w:cs="Carlito"/>
+          <w:b/>
+          <w:bCs/>
+          <w:sz w:val="32"/>
+          <w:szCs w:val="32"/>
         </w:rPr>
         <w:tab/>
       </w:r>
       <w:r>
         <w:rPr>
-          <w:rFonts w:ascii="Carlito" w:hAnsi="Carlito" w:cs="Carlito"/>
-          <w:sz w:val="34"/>
-          <w:szCs w:val="34"/>
+          <w:rFonts w:cs="Carlito"/>
+          <w:sz w:val="32"/>
+          <w:szCs w:val="32"/>
         </w:rPr>
         <w:tab/>
       </w:r>
       <w:r>
         <w:rPr>
-          <w:rFonts w:ascii="Carlito" w:hAnsi="Carlito" w:cs="Carlito"/>
-          <w:sz w:val="22"/>
-          <w:szCs w:val="22"/>
+          <w:rFonts w:cs="Carlito"/>
+          <w:sz w:val="20"/>
+          <w:szCs w:val="20"/>
         </w:rPr>
         <w:sym w:font="Wingdings" w:char="F0E0"/>
       </w:r>
       <w:r>
         <w:rPr>
-          <w:rFonts w:ascii="Carlito" w:hAnsi="Carlito" w:cs="Carlito"/>
-          <w:sz w:val="34"/>
-          <w:szCs w:val="34"/>
+          <w:rFonts w:cs="Carlito"/>
+          <w:sz w:val="32"/>
+          <w:szCs w:val="32"/>
         </w:rPr>
         <w:tab/>
         <w:t>Where the sequence begins</w:t>
@@ -796,52 +796,52 @@
         </w:numPr>
         <w:jc w:val="both"/>
         <w:rPr>
-          <w:rFonts w:ascii="Carlito" w:hAnsi="Carlito" w:cs="Carlito"/>
-          <w:sz w:val="34"/>
-          <w:szCs w:val="34"/>
-        </w:rPr>
-      </w:pPr>
-      <w:r>
-        <w:rPr>
-          <w:rFonts w:ascii="Carlito" w:hAnsi="Carlito" w:cs="Carlito"/>
-          <w:b/>
-          <w:bCs/>
-          <w:sz w:val="34"/>
-          <w:szCs w:val="34"/>
+          <w:rFonts w:cs="Carlito"/>
+          <w:sz w:val="32"/>
+          <w:szCs w:val="32"/>
+        </w:rPr>
+      </w:pPr>
+      <w:r>
+        <w:rPr>
+          <w:rFonts w:cs="Carlito"/>
+          <w:b/>
+          <w:bCs/>
+          <w:sz w:val="32"/>
+          <w:szCs w:val="32"/>
         </w:rPr>
         <w:t>stop</w:t>
       </w:r>
       <w:r>
         <w:rPr>
-          <w:rFonts w:ascii="Carlito" w:hAnsi="Carlito" w:cs="Carlito"/>
-          <w:b/>
-          <w:bCs/>
-          <w:sz w:val="34"/>
-          <w:szCs w:val="34"/>
+          <w:rFonts w:cs="Carlito"/>
+          <w:b/>
+          <w:bCs/>
+          <w:sz w:val="32"/>
+          <w:szCs w:val="32"/>
         </w:rPr>
         <w:tab/>
       </w:r>
       <w:r>
         <w:rPr>
-          <w:rFonts w:ascii="Carlito" w:hAnsi="Carlito" w:cs="Carlito"/>
-          <w:sz w:val="34"/>
-          <w:szCs w:val="34"/>
+          <w:rFonts w:cs="Carlito"/>
+          <w:sz w:val="32"/>
+          <w:szCs w:val="32"/>
         </w:rPr>
         <w:tab/>
       </w:r>
       <w:r>
         <w:rPr>
-          <w:rFonts w:ascii="Carlito" w:hAnsi="Carlito" w:cs="Carlito"/>
-          <w:sz w:val="22"/>
-          <w:szCs w:val="22"/>
+          <w:rFonts w:cs="Carlito"/>
+          <w:sz w:val="20"/>
+          <w:szCs w:val="20"/>
         </w:rPr>
         <w:sym w:font="Wingdings" w:char="F0E0"/>
       </w:r>
       <w:r>
         <w:rPr>
-          <w:rFonts w:ascii="Carlito" w:hAnsi="Carlito" w:cs="Carlito"/>
-          <w:sz w:val="34"/>
-          <w:szCs w:val="34"/>
+          <w:rFonts w:cs="Carlito"/>
+          <w:sz w:val="32"/>
+          <w:szCs w:val="32"/>
         </w:rPr>
         <w:tab/>
         <w:t>Where the sequence ends, but not included</w:t>
@@ -856,50 +856,50 @@
         </w:numPr>
         <w:jc w:val="both"/>
         <w:rPr>
-          <w:rFonts w:ascii="Carlito" w:hAnsi="Carlito" w:cs="Carlito"/>
-          <w:sz w:val="34"/>
-          <w:szCs w:val="34"/>
-        </w:rPr>
-      </w:pPr>
-      <w:r>
-        <w:rPr>
-          <w:rFonts w:ascii="Carlito" w:hAnsi="Carlito" w:cs="Carlito"/>
-          <w:b/>
-          <w:bCs/>
-          <w:sz w:val="34"/>
-          <w:szCs w:val="34"/>
+          <w:rFonts w:cs="Carlito"/>
+          <w:sz w:val="32"/>
+          <w:szCs w:val="32"/>
+        </w:rPr>
+      </w:pPr>
+      <w:r>
+        <w:rPr>
+          <w:rFonts w:cs="Carlito"/>
+          <w:b/>
+          <w:bCs/>
+          <w:sz w:val="32"/>
+          <w:szCs w:val="32"/>
         </w:rPr>
         <w:t>step</w:t>
       </w:r>
       <w:r>
         <w:rPr>
-          <w:rFonts w:ascii="Carlito" w:hAnsi="Carlito" w:cs="Carlito"/>
-          <w:sz w:val="34"/>
-          <w:szCs w:val="34"/>
+          <w:rFonts w:cs="Carlito"/>
+          <w:sz w:val="32"/>
+          <w:szCs w:val="32"/>
         </w:rPr>
         <w:tab/>
       </w:r>
       <w:r>
         <w:rPr>
-          <w:rFonts w:ascii="Carlito" w:hAnsi="Carlito" w:cs="Carlito"/>
-          <w:sz w:val="34"/>
-          <w:szCs w:val="34"/>
+          <w:rFonts w:cs="Carlito"/>
+          <w:sz w:val="32"/>
+          <w:szCs w:val="32"/>
         </w:rPr>
         <w:tab/>
       </w:r>
       <w:r>
         <w:rPr>
-          <w:rFonts w:ascii="Carlito" w:hAnsi="Carlito" w:cs="Carlito"/>
-          <w:sz w:val="22"/>
-          <w:szCs w:val="22"/>
+          <w:rFonts w:cs="Carlito"/>
+          <w:sz w:val="20"/>
+          <w:szCs w:val="20"/>
         </w:rPr>
         <w:sym w:font="Wingdings" w:char="F0E0"/>
       </w:r>
       <w:r>
         <w:rPr>
-          <w:rFonts w:ascii="Carlito" w:hAnsi="Carlito" w:cs="Carlito"/>
-          <w:sz w:val="34"/>
-          <w:szCs w:val="34"/>
+          <w:rFonts w:cs="Carlito"/>
+          <w:sz w:val="32"/>
+          <w:szCs w:val="32"/>
         </w:rPr>
         <w:tab/>
         <w:t>How much to increase each time (default = 1)</w:t>
@@ -909,16 +909,16 @@
       <w:pPr>
         <w:jc w:val="both"/>
         <w:rPr>
-          <w:rFonts w:ascii="Carlito" w:hAnsi="Carlito" w:cs="Carlito"/>
-          <w:sz w:val="34"/>
-          <w:szCs w:val="34"/>
-        </w:rPr>
-      </w:pPr>
-      <w:r>
-        <w:rPr>
-          <w:rFonts w:ascii="Carlito" w:hAnsi="Carlito" w:cs="Carlito"/>
-          <w:sz w:val="34"/>
-          <w:szCs w:val="34"/>
+          <w:rFonts w:cs="Carlito"/>
+          <w:sz w:val="32"/>
+          <w:szCs w:val="32"/>
+        </w:rPr>
+      </w:pPr>
+      <w:r>
+        <w:rPr>
+          <w:rFonts w:cs="Carlito"/>
+          <w:sz w:val="32"/>
+          <w:szCs w:val="32"/>
         </w:rPr>
         <w:t xml:space="preserve"># </w:t>
       </w:r>
@@ -926,9 +926,9 @@
       <w:proofErr w:type="gramStart"/>
       <w:r>
         <w:rPr>
-          <w:rFonts w:ascii="Carlito" w:hAnsi="Carlito" w:cs="Carlito"/>
-          <w:sz w:val="34"/>
-          <w:szCs w:val="34"/>
+          <w:rFonts w:cs="Carlito"/>
+          <w:sz w:val="32"/>
+          <w:szCs w:val="32"/>
         </w:rPr>
         <w:t>np.arange</w:t>
       </w:r>
@@ -936,19 +936,19 @@
       <w:proofErr w:type="gramEnd"/>
       <w:r>
         <w:rPr>
-          <w:rFonts w:ascii="Carlito" w:hAnsi="Carlito" w:cs="Carlito"/>
-          <w:sz w:val="34"/>
-          <w:szCs w:val="34"/>
+          <w:rFonts w:cs="Carlito"/>
+          <w:sz w:val="32"/>
+          <w:szCs w:val="32"/>
         </w:rPr>
         <w:t xml:space="preserve">(1, 6) this means start at 1 end at 6 (but NOT included → NumPy stops before the stop value) so the output will be  </w:t>
       </w:r>
       <w:r>
         <w:rPr>
-          <w:rFonts w:ascii="Carlito" w:hAnsi="Carlito" w:cs="Carlito"/>
-          <w:b/>
-          <w:bCs/>
-          <w:sz w:val="34"/>
-          <w:szCs w:val="34"/>
+          <w:rFonts w:cs="Carlito"/>
+          <w:b/>
+          <w:bCs/>
+          <w:sz w:val="32"/>
+          <w:szCs w:val="32"/>
         </w:rPr>
         <w:t>array([1, 2, 3, 4, 5])</w:t>
       </w:r>
@@ -957,46 +957,46 @@
       <w:pPr>
         <w:jc w:val="both"/>
         <w:rPr>
-          <w:rFonts w:ascii="Carlito" w:hAnsi="Carlito" w:cs="Carlito"/>
-          <w:b/>
-          <w:bCs/>
-          <w:color w:val="D86DCB" w:themeColor="accent5" w:themeTint="99"/>
-          <w:sz w:val="34"/>
-          <w:szCs w:val="34"/>
-        </w:rPr>
-      </w:pPr>
-      <w:r>
-        <w:rPr>
-          <w:rFonts w:ascii="Carlito" w:hAnsi="Carlito" w:cs="Carlito"/>
-          <w:b/>
-          <w:bCs/>
-          <w:color w:val="D86DCB" w:themeColor="accent5" w:themeTint="99"/>
-          <w:sz w:val="34"/>
-          <w:szCs w:val="34"/>
+          <w:rFonts w:cs="Carlito"/>
+          <w:b/>
+          <w:bCs/>
+          <w:color w:val="D86DCB" w:themeColor="accent5" w:themeTint="99"/>
+          <w:sz w:val="32"/>
+          <w:szCs w:val="32"/>
+        </w:rPr>
+      </w:pPr>
+      <w:r>
+        <w:rPr>
+          <w:rFonts w:cs="Carlito"/>
+          <w:b/>
+          <w:bCs/>
+          <w:color w:val="D86DCB" w:themeColor="accent5" w:themeTint="99"/>
+          <w:sz w:val="32"/>
+          <w:szCs w:val="32"/>
         </w:rPr>
         <w:t xml:space="preserve">import </w:t>
       </w:r>
       <w:proofErr w:type="spellStart"/>
       <w:r>
         <w:rPr>
-          <w:rFonts w:ascii="Carlito" w:hAnsi="Carlito" w:cs="Carlito"/>
-          <w:b/>
-          <w:bCs/>
-          <w:color w:val="D86DCB" w:themeColor="accent5" w:themeTint="99"/>
-          <w:sz w:val="34"/>
-          <w:szCs w:val="34"/>
+          <w:rFonts w:cs="Carlito"/>
+          <w:b/>
+          <w:bCs/>
+          <w:color w:val="D86DCB" w:themeColor="accent5" w:themeTint="99"/>
+          <w:sz w:val="32"/>
+          <w:szCs w:val="32"/>
         </w:rPr>
         <w:t>numpy</w:t>
       </w:r>
       <w:proofErr w:type="spellEnd"/>
       <w:r>
         <w:rPr>
-          <w:rFonts w:ascii="Carlito" w:hAnsi="Carlito" w:cs="Carlito"/>
-          <w:b/>
-          <w:bCs/>
-          <w:color w:val="D86DCB" w:themeColor="accent5" w:themeTint="99"/>
-          <w:sz w:val="34"/>
-          <w:szCs w:val="34"/>
+          <w:rFonts w:cs="Carlito"/>
+          <w:b/>
+          <w:bCs/>
+          <w:color w:val="D86DCB" w:themeColor="accent5" w:themeTint="99"/>
+          <w:sz w:val="32"/>
+          <w:szCs w:val="32"/>
         </w:rPr>
         <w:t xml:space="preserve"> as np</w:t>
       </w:r>
@@ -1005,22 +1005,22 @@
       <w:pPr>
         <w:jc w:val="both"/>
         <w:rPr>
-          <w:rFonts w:ascii="Carlito" w:hAnsi="Carlito" w:cs="Carlito"/>
-          <w:b/>
-          <w:bCs/>
-          <w:color w:val="D86DCB" w:themeColor="accent5" w:themeTint="99"/>
-          <w:sz w:val="34"/>
-          <w:szCs w:val="34"/>
-        </w:rPr>
-      </w:pPr>
-      <w:r>
-        <w:rPr>
-          <w:rFonts w:ascii="Carlito" w:hAnsi="Carlito" w:cs="Carlito"/>
-          <w:b/>
-          <w:bCs/>
-          <w:color w:val="D86DCB" w:themeColor="accent5" w:themeTint="99"/>
-          <w:sz w:val="34"/>
-          <w:szCs w:val="34"/>
+          <w:rFonts w:cs="Carlito"/>
+          <w:b/>
+          <w:bCs/>
+          <w:color w:val="D86DCB" w:themeColor="accent5" w:themeTint="99"/>
+          <w:sz w:val="32"/>
+          <w:szCs w:val="32"/>
+        </w:rPr>
+      </w:pPr>
+      <w:r>
+        <w:rPr>
+          <w:rFonts w:cs="Carlito"/>
+          <w:b/>
+          <w:bCs/>
+          <w:color w:val="D86DCB" w:themeColor="accent5" w:themeTint="99"/>
+          <w:sz w:val="32"/>
+          <w:szCs w:val="32"/>
         </w:rPr>
         <w:t xml:space="preserve">numbers = </w:t>
       </w:r>
@@ -1028,12 +1028,12 @@
       <w:proofErr w:type="gramStart"/>
       <w:r>
         <w:rPr>
-          <w:rFonts w:ascii="Carlito" w:hAnsi="Carlito" w:cs="Carlito"/>
-          <w:b/>
-          <w:bCs/>
-          <w:color w:val="D86DCB" w:themeColor="accent5" w:themeTint="99"/>
-          <w:sz w:val="34"/>
-          <w:szCs w:val="34"/>
+          <w:rFonts w:cs="Carlito"/>
+          <w:b/>
+          <w:bCs/>
+          <w:color w:val="D86DCB" w:themeColor="accent5" w:themeTint="99"/>
+          <w:sz w:val="32"/>
+          <w:szCs w:val="32"/>
         </w:rPr>
         <w:t>np.arange</w:t>
       </w:r>
@@ -1041,12 +1041,12 @@
       <w:proofErr w:type="gramEnd"/>
       <w:r>
         <w:rPr>
-          <w:rFonts w:ascii="Carlito" w:hAnsi="Carlito" w:cs="Carlito"/>
-          <w:b/>
-          <w:bCs/>
-          <w:color w:val="D86DCB" w:themeColor="accent5" w:themeTint="99"/>
-          <w:sz w:val="34"/>
-          <w:szCs w:val="34"/>
+          <w:rFonts w:cs="Carlito"/>
+          <w:b/>
+          <w:bCs/>
+          <w:color w:val="D86DCB" w:themeColor="accent5" w:themeTint="99"/>
+          <w:sz w:val="32"/>
+          <w:szCs w:val="32"/>
         </w:rPr>
         <w:t>(1, 6)</w:t>
       </w:r>
@@ -1055,23 +1055,23 @@
       <w:pPr>
         <w:jc w:val="both"/>
         <w:rPr>
-          <w:rFonts w:ascii="Carlito" w:hAnsi="Carlito" w:cs="Carlito"/>
-          <w:b/>
-          <w:bCs/>
-          <w:color w:val="D86DCB" w:themeColor="accent5" w:themeTint="99"/>
-          <w:sz w:val="34"/>
-          <w:szCs w:val="34"/>
+          <w:rFonts w:cs="Carlito"/>
+          <w:b/>
+          <w:bCs/>
+          <w:color w:val="D86DCB" w:themeColor="accent5" w:themeTint="99"/>
+          <w:sz w:val="32"/>
+          <w:szCs w:val="32"/>
         </w:rPr>
       </w:pPr>
       <w:proofErr w:type="gramStart"/>
       <w:r>
         <w:rPr>
-          <w:rFonts w:ascii="Carlito" w:hAnsi="Carlito" w:cs="Carlito"/>
-          <w:b/>
-          <w:bCs/>
-          <w:color w:val="D86DCB" w:themeColor="accent5" w:themeTint="99"/>
-          <w:sz w:val="34"/>
-          <w:szCs w:val="34"/>
+          <w:rFonts w:cs="Carlito"/>
+          <w:b/>
+          <w:bCs/>
+          <w:color w:val="D86DCB" w:themeColor="accent5" w:themeTint="99"/>
+          <w:sz w:val="32"/>
+          <w:szCs w:val="32"/>
         </w:rPr>
         <w:t>print(</w:t>
       </w:r>
@@ -1079,24 +1079,24 @@
       <w:proofErr w:type="gramEnd"/>
       <w:r>
         <w:rPr>
-          <w:rFonts w:ascii="Carlito" w:hAnsi="Carlito" w:cs="Carlito"/>
-          <w:b/>
-          <w:bCs/>
-          <w:color w:val="D86DCB" w:themeColor="accent5" w:themeTint="99"/>
-          <w:sz w:val="34"/>
-          <w:szCs w:val="34"/>
+          <w:rFonts w:cs="Carlito"/>
+          <w:b/>
+          <w:bCs/>
+          <w:color w:val="D86DCB" w:themeColor="accent5" w:themeTint="99"/>
+          <w:sz w:val="32"/>
+          <w:szCs w:val="32"/>
         </w:rPr>
         <w:t>f'Sequence</w:t>
       </w:r>
       <w:proofErr w:type="spellEnd"/>
       <w:r>
         <w:rPr>
-          <w:rFonts w:ascii="Carlito" w:hAnsi="Carlito" w:cs="Carlito"/>
-          <w:b/>
-          <w:bCs/>
-          <w:color w:val="D86DCB" w:themeColor="accent5" w:themeTint="99"/>
-          <w:sz w:val="34"/>
-          <w:szCs w:val="34"/>
+          <w:rFonts w:cs="Carlito"/>
+          <w:b/>
+          <w:bCs/>
+          <w:color w:val="D86DCB" w:themeColor="accent5" w:themeTint="99"/>
+          <w:sz w:val="32"/>
+          <w:szCs w:val="32"/>
         </w:rPr>
         <w:t xml:space="preserve"> of Numbers : {numbers}')</w:t>
       </w:r>
@@ -1105,22 +1105,22 @@
       <w:pPr>
         <w:jc w:val="both"/>
         <w:rPr>
-          <w:rFonts w:ascii="Carlito" w:hAnsi="Carlito" w:cs="Carlito"/>
-          <w:b/>
-          <w:bCs/>
-          <w:color w:val="D86DCB" w:themeColor="accent5" w:themeTint="99"/>
-          <w:sz w:val="34"/>
-          <w:szCs w:val="34"/>
-        </w:rPr>
-      </w:pPr>
-      <w:r>
-        <w:rPr>
-          <w:rFonts w:ascii="Carlito" w:hAnsi="Carlito" w:cs="Carlito"/>
-          <w:b/>
-          <w:bCs/>
-          <w:color w:val="D86DCB" w:themeColor="accent5" w:themeTint="99"/>
-          <w:sz w:val="34"/>
-          <w:szCs w:val="34"/>
+          <w:rFonts w:cs="Carlito"/>
+          <w:b/>
+          <w:bCs/>
+          <w:color w:val="D86DCB" w:themeColor="accent5" w:themeTint="99"/>
+          <w:sz w:val="32"/>
+          <w:szCs w:val="32"/>
+        </w:rPr>
+      </w:pPr>
+      <w:r>
+        <w:rPr>
+          <w:rFonts w:cs="Carlito"/>
+          <w:b/>
+          <w:bCs/>
+          <w:color w:val="D86DCB" w:themeColor="accent5" w:themeTint="99"/>
+          <w:sz w:val="32"/>
+          <w:szCs w:val="32"/>
         </w:rPr>
         <w:t xml:space="preserve">numbers2 = </w:t>
       </w:r>
@@ -1128,12 +1128,12 @@
       <w:proofErr w:type="gramStart"/>
       <w:r>
         <w:rPr>
-          <w:rFonts w:ascii="Carlito" w:hAnsi="Carlito" w:cs="Carlito"/>
-          <w:b/>
-          <w:bCs/>
-          <w:color w:val="D86DCB" w:themeColor="accent5" w:themeTint="99"/>
-          <w:sz w:val="34"/>
-          <w:szCs w:val="34"/>
+          <w:rFonts w:cs="Carlito"/>
+          <w:b/>
+          <w:bCs/>
+          <w:color w:val="D86DCB" w:themeColor="accent5" w:themeTint="99"/>
+          <w:sz w:val="32"/>
+          <w:szCs w:val="32"/>
         </w:rPr>
         <w:t>np.arange</w:t>
       </w:r>
@@ -1141,12 +1141,12 @@
       <w:proofErr w:type="gramEnd"/>
       <w:r>
         <w:rPr>
-          <w:rFonts w:ascii="Carlito" w:hAnsi="Carlito" w:cs="Carlito"/>
-          <w:b/>
-          <w:bCs/>
-          <w:color w:val="D86DCB" w:themeColor="accent5" w:themeTint="99"/>
-          <w:sz w:val="34"/>
-          <w:szCs w:val="34"/>
+          <w:rFonts w:cs="Carlito"/>
+          <w:b/>
+          <w:bCs/>
+          <w:color w:val="D86DCB" w:themeColor="accent5" w:themeTint="99"/>
+          <w:sz w:val="32"/>
+          <w:szCs w:val="32"/>
         </w:rPr>
         <w:t>(1,8,2)</w:t>
       </w:r>
@@ -1155,23 +1155,23 @@
       <w:pPr>
         <w:jc w:val="both"/>
         <w:rPr>
-          <w:rFonts w:ascii="Carlito" w:hAnsi="Carlito" w:cs="Carlito"/>
-          <w:b/>
-          <w:bCs/>
-          <w:color w:val="D86DCB" w:themeColor="accent5" w:themeTint="99"/>
-          <w:sz w:val="34"/>
-          <w:szCs w:val="34"/>
+          <w:rFonts w:cs="Carlito"/>
+          <w:b/>
+          <w:bCs/>
+          <w:color w:val="D86DCB" w:themeColor="accent5" w:themeTint="99"/>
+          <w:sz w:val="32"/>
+          <w:szCs w:val="32"/>
         </w:rPr>
       </w:pPr>
       <w:proofErr w:type="gramStart"/>
       <w:r>
         <w:rPr>
-          <w:rFonts w:ascii="Carlito" w:hAnsi="Carlito" w:cs="Carlito"/>
-          <w:b/>
-          <w:bCs/>
-          <w:color w:val="D86DCB" w:themeColor="accent5" w:themeTint="99"/>
-          <w:sz w:val="34"/>
-          <w:szCs w:val="34"/>
+          <w:rFonts w:cs="Carlito"/>
+          <w:b/>
+          <w:bCs/>
+          <w:color w:val="D86DCB" w:themeColor="accent5" w:themeTint="99"/>
+          <w:sz w:val="32"/>
+          <w:szCs w:val="32"/>
         </w:rPr>
         <w:t>print(</w:t>
       </w:r>
@@ -1179,24 +1179,24 @@
       <w:proofErr w:type="gramEnd"/>
       <w:r>
         <w:rPr>
-          <w:rFonts w:ascii="Carlito" w:hAnsi="Carlito" w:cs="Carlito"/>
-          <w:b/>
-          <w:bCs/>
-          <w:color w:val="D86DCB" w:themeColor="accent5" w:themeTint="99"/>
-          <w:sz w:val="34"/>
-          <w:szCs w:val="34"/>
+          <w:rFonts w:cs="Carlito"/>
+          <w:b/>
+          <w:bCs/>
+          <w:color w:val="D86DCB" w:themeColor="accent5" w:themeTint="99"/>
+          <w:sz w:val="32"/>
+          <w:szCs w:val="32"/>
         </w:rPr>
         <w:t>f'Sequence</w:t>
       </w:r>
       <w:proofErr w:type="spellEnd"/>
       <w:r>
         <w:rPr>
-          <w:rFonts w:ascii="Carlito" w:hAnsi="Carlito" w:cs="Carlito"/>
-          <w:b/>
-          <w:bCs/>
-          <w:color w:val="D86DCB" w:themeColor="accent5" w:themeTint="99"/>
-          <w:sz w:val="34"/>
-          <w:szCs w:val="34"/>
+          <w:rFonts w:cs="Carlito"/>
+          <w:b/>
+          <w:bCs/>
+          <w:color w:val="D86DCB" w:themeColor="accent5" w:themeTint="99"/>
+          <w:sz w:val="32"/>
+          <w:szCs w:val="32"/>
         </w:rPr>
         <w:t xml:space="preserve"> of Numbers with step : {numbers2}')</w:t>
       </w:r>
@@ -1205,30 +1205,30 @@
       <w:pPr>
         <w:jc w:val="both"/>
         <w:rPr>
-          <w:rFonts w:ascii="Carlito" w:hAnsi="Carlito" w:cs="Carlito"/>
-          <w:sz w:val="34"/>
-          <w:szCs w:val="34"/>
-        </w:rPr>
-      </w:pPr>
-    </w:p>
-    <w:p>
-      <w:pPr>
-        <w:jc w:val="both"/>
-        <w:rPr>
-          <w:rFonts w:ascii="Carlito" w:hAnsi="Carlito" w:cs="Carlito"/>
-          <w:b/>
-          <w:bCs/>
-          <w:sz w:val="34"/>
-          <w:szCs w:val="34"/>
-        </w:rPr>
-      </w:pPr>
-      <w:r>
-        <w:rPr>
-          <w:rFonts w:ascii="Carlito" w:hAnsi="Carlito" w:cs="Carlito"/>
-          <w:b/>
-          <w:bCs/>
-          <w:sz w:val="34"/>
-          <w:szCs w:val="34"/>
+          <w:rFonts w:cs="Carlito"/>
+          <w:sz w:val="32"/>
+          <w:szCs w:val="32"/>
+        </w:rPr>
+      </w:pPr>
+    </w:p>
+    <w:p>
+      <w:pPr>
+        <w:jc w:val="both"/>
+        <w:rPr>
+          <w:rFonts w:cs="Carlito"/>
+          <w:b/>
+          <w:bCs/>
+          <w:sz w:val="32"/>
+          <w:szCs w:val="32"/>
+        </w:rPr>
+      </w:pPr>
+      <w:r>
+        <w:rPr>
+          <w:rFonts w:cs="Carlito"/>
+          <w:b/>
+          <w:bCs/>
+          <w:sz w:val="32"/>
+          <w:szCs w:val="32"/>
         </w:rPr>
         <w:t>Broadcasting:</w:t>
       </w:r>
@@ -1237,108 +1237,108 @@
       <w:pPr>
         <w:jc w:val="both"/>
         <w:rPr>
-          <w:rFonts w:ascii="Carlito" w:hAnsi="Carlito" w:cs="Carlito"/>
-          <w:sz w:val="34"/>
-          <w:szCs w:val="34"/>
-        </w:rPr>
-      </w:pPr>
-      <w:r>
-        <w:rPr>
-          <w:rFonts w:ascii="Carlito" w:hAnsi="Carlito" w:cs="Carlito"/>
-          <w:sz w:val="34"/>
-          <w:szCs w:val="34"/>
+          <w:rFonts w:cs="Carlito"/>
+          <w:sz w:val="32"/>
+          <w:szCs w:val="32"/>
+        </w:rPr>
+      </w:pPr>
+      <w:r>
+        <w:rPr>
+          <w:rFonts w:cs="Carlito"/>
+          <w:sz w:val="32"/>
+          <w:szCs w:val="32"/>
         </w:rPr>
         <w:t xml:space="preserve"># </w:t>
       </w:r>
       <w:r>
         <w:rPr>
-          <w:rFonts w:ascii="Carlito" w:hAnsi="Carlito" w:cs="Carlito"/>
-          <w:sz w:val="34"/>
-          <w:szCs w:val="34"/>
+          <w:rFonts w:cs="Carlito"/>
+          <w:sz w:val="32"/>
+          <w:szCs w:val="32"/>
         </w:rPr>
         <w:t>Broadcasting in</w:t>
       </w:r>
       <w:r>
         <w:rPr>
-          <w:rFonts w:ascii="Carlito" w:hAnsi="Carlito" w:cs="Carlito"/>
-          <w:b/>
-          <w:bCs/>
-          <w:sz w:val="34"/>
-          <w:szCs w:val="34"/>
+          <w:rFonts w:cs="Carlito"/>
+          <w:b/>
+          <w:bCs/>
+          <w:sz w:val="32"/>
+          <w:szCs w:val="32"/>
         </w:rPr>
         <w:t xml:space="preserve"> NumPy</w:t>
       </w:r>
       <w:r>
         <w:rPr>
-          <w:rFonts w:ascii="Carlito" w:hAnsi="Carlito" w:cs="Carlito"/>
-          <w:sz w:val="34"/>
-          <w:szCs w:val="34"/>
+          <w:rFonts w:cs="Carlito"/>
+          <w:sz w:val="32"/>
+          <w:szCs w:val="32"/>
         </w:rPr>
         <w:t xml:space="preserve"> means automatically expanding smaller arrays (or scalars) so they can perform element-wise operations with larger arrays without actually copying data. In simple terms</w:t>
       </w:r>
       <w:r>
         <w:rPr>
-          <w:rFonts w:ascii="Carlito" w:hAnsi="Carlito" w:cs="Carlito"/>
-          <w:sz w:val="34"/>
-          <w:szCs w:val="34"/>
+          <w:rFonts w:cs="Carlito"/>
+          <w:sz w:val="32"/>
+          <w:szCs w:val="32"/>
         </w:rPr>
         <w:t>, w</w:t>
       </w:r>
       <w:r>
         <w:rPr>
-          <w:rFonts w:ascii="Carlito" w:hAnsi="Carlito" w:cs="Carlito"/>
-          <w:sz w:val="34"/>
-          <w:szCs w:val="34"/>
+          <w:rFonts w:cs="Carlito"/>
+          <w:sz w:val="32"/>
+          <w:szCs w:val="32"/>
         </w:rPr>
         <w:t xml:space="preserve">hen arrays have different shapes, </w:t>
       </w:r>
       <w:r>
         <w:rPr>
-          <w:rFonts w:ascii="Carlito" w:hAnsi="Carlito" w:cs="Carlito"/>
-          <w:b/>
-          <w:bCs/>
-          <w:sz w:val="34"/>
-          <w:szCs w:val="34"/>
+          <w:rFonts w:cs="Carlito"/>
+          <w:b/>
+          <w:bCs/>
+          <w:sz w:val="32"/>
+          <w:szCs w:val="32"/>
         </w:rPr>
         <w:t>NumPy</w:t>
       </w:r>
       <w:r>
         <w:rPr>
-          <w:rFonts w:ascii="Carlito" w:hAnsi="Carlito" w:cs="Carlito"/>
-          <w:sz w:val="34"/>
-          <w:szCs w:val="34"/>
+          <w:rFonts w:cs="Carlito"/>
+          <w:sz w:val="32"/>
+          <w:szCs w:val="32"/>
         </w:rPr>
         <w:t xml:space="preserve"> "stretches" one to match the other if possible</w:t>
       </w:r>
       <w:r>
         <w:rPr>
-          <w:rFonts w:ascii="Carlito" w:hAnsi="Carlito" w:cs="Carlito"/>
-          <w:sz w:val="34"/>
-          <w:szCs w:val="34"/>
+          <w:rFonts w:cs="Carlito"/>
+          <w:sz w:val="32"/>
+          <w:szCs w:val="32"/>
         </w:rPr>
         <w:t>. S</w:t>
       </w:r>
       <w:r>
         <w:rPr>
-          <w:rFonts w:ascii="Carlito" w:hAnsi="Carlito" w:cs="Carlito"/>
-          <w:sz w:val="34"/>
-          <w:szCs w:val="34"/>
+          <w:rFonts w:cs="Carlito"/>
+          <w:sz w:val="32"/>
+          <w:szCs w:val="32"/>
         </w:rPr>
         <w:t>o</w:t>
       </w:r>
       <w:r>
         <w:rPr>
-          <w:rFonts w:ascii="Carlito" w:hAnsi="Carlito" w:cs="Carlito"/>
-          <w:sz w:val="34"/>
-          <w:szCs w:val="34"/>
+          <w:rFonts w:cs="Carlito"/>
+          <w:sz w:val="32"/>
+          <w:szCs w:val="32"/>
         </w:rPr>
         <w:t>,</w:t>
       </w:r>
       <w:r>
         <w:rPr>
-          <w:rFonts w:ascii="Carlito" w:hAnsi="Carlito" w:cs="Carlito"/>
-          <w:sz w:val="34"/>
-          <w:szCs w:val="34"/>
+          <w:rFonts w:cs="Carlito"/>
+          <w:sz w:val="32"/>
+          <w:szCs w:val="32"/>
         </w:rPr>
         <w:t xml:space="preserve"> operations can happen element by element.</w:t>
       </w:r>
@@ -1347,52 +1347,52 @@
       <w:pPr>
         <w:jc w:val="both"/>
         <w:rPr>
-          <w:rFonts w:ascii="Carlito" w:hAnsi="Carlito" w:cs="Carlito"/>
-          <w:sz w:val="34"/>
-          <w:szCs w:val="34"/>
-        </w:rPr>
-      </w:pPr>
-      <w:r>
-        <w:rPr>
-          <w:rFonts w:ascii="Carlito" w:hAnsi="Carlito" w:cs="Carlito"/>
-          <w:sz w:val="34"/>
-          <w:szCs w:val="34"/>
+          <w:rFonts w:cs="Carlito"/>
+          <w:sz w:val="32"/>
+          <w:szCs w:val="32"/>
+        </w:rPr>
+      </w:pPr>
+      <w:r>
+        <w:rPr>
+          <w:rFonts w:cs="Carlito"/>
+          <w:sz w:val="32"/>
+          <w:szCs w:val="32"/>
         </w:rPr>
         <w:t xml:space="preserve"># NumPy automatically broadcasts </w:t>
       </w:r>
       <w:r>
         <w:rPr>
-          <w:rFonts w:ascii="Carlito" w:hAnsi="Carlito" w:cs="Carlito"/>
-          <w:b/>
-          <w:bCs/>
-          <w:sz w:val="34"/>
-          <w:szCs w:val="34"/>
+          <w:rFonts w:cs="Carlito"/>
+          <w:b/>
+          <w:bCs/>
+          <w:sz w:val="32"/>
+          <w:szCs w:val="32"/>
         </w:rPr>
         <w:t>10</w:t>
       </w:r>
       <w:r>
         <w:rPr>
-          <w:rFonts w:ascii="Carlito" w:hAnsi="Carlito" w:cs="Carlito"/>
-          <w:sz w:val="34"/>
-          <w:szCs w:val="34"/>
+          <w:rFonts w:cs="Carlito"/>
+          <w:sz w:val="32"/>
+          <w:szCs w:val="32"/>
         </w:rPr>
         <w:t xml:space="preserve"> to match the shape of </w:t>
       </w:r>
       <w:r>
         <w:rPr>
-          <w:rFonts w:ascii="Carlito" w:hAnsi="Carlito" w:cs="Carlito"/>
-          <w:b/>
-          <w:bCs/>
-          <w:sz w:val="34"/>
-          <w:szCs w:val="34"/>
+          <w:rFonts w:cs="Carlito"/>
+          <w:b/>
+          <w:bCs/>
+          <w:sz w:val="32"/>
+          <w:szCs w:val="32"/>
         </w:rPr>
         <w:t>a</w:t>
       </w:r>
       <w:r>
         <w:rPr>
-          <w:rFonts w:ascii="Carlito" w:hAnsi="Carlito" w:cs="Carlito"/>
-          <w:sz w:val="34"/>
-          <w:szCs w:val="34"/>
+          <w:rFonts w:cs="Carlito"/>
+          <w:sz w:val="32"/>
+          <w:szCs w:val="32"/>
         </w:rPr>
         <w:t>. No manual loop, no copying it just pretends the scalar is repeated.</w:t>
       </w:r>
@@ -1401,95 +1401,95 @@
       <w:pPr>
         <w:jc w:val="both"/>
         <w:rPr>
-          <w:rFonts w:ascii="Carlito" w:hAnsi="Carlito" w:cs="Carlito"/>
+          <w:rFonts w:cs="Carlito"/>
           <w:b/>
           <w:bCs/>
           <w:color w:val="60CAF3" w:themeColor="accent4" w:themeTint="99"/>
-          <w:sz w:val="34"/>
-          <w:szCs w:val="34"/>
-        </w:rPr>
-      </w:pPr>
-      <w:r>
-        <w:rPr>
-          <w:rFonts w:ascii="Carlito" w:hAnsi="Carlito" w:cs="Carlito"/>
+          <w:sz w:val="32"/>
+          <w:szCs w:val="32"/>
+        </w:rPr>
+      </w:pPr>
+      <w:r>
+        <w:rPr>
+          <w:rFonts w:cs="Carlito"/>
           <w:b/>
           <w:bCs/>
           <w:color w:val="60CAF3" w:themeColor="accent4" w:themeTint="99"/>
-          <w:sz w:val="34"/>
-          <w:szCs w:val="34"/>
+          <w:sz w:val="32"/>
+          <w:szCs w:val="32"/>
+        </w:rPr>
+        <w:t>[1, 2, 3, 4]</w:t>
+      </w:r>
+    </w:p>
+    <w:p>
+      <w:pPr>
+        <w:jc w:val="both"/>
+        <w:rPr>
+          <w:rFonts w:cs="Carlito"/>
+          <w:b/>
+          <w:bCs/>
+          <w:color w:val="60CAF3" w:themeColor="accent4" w:themeTint="99"/>
+          <w:sz w:val="32"/>
+          <w:szCs w:val="32"/>
+        </w:rPr>
+      </w:pPr>
+      <w:r>
+        <w:rPr>
+          <w:rFonts w:cs="Carlito"/>
+          <w:b/>
+          <w:bCs/>
+          <w:color w:val="60CAF3" w:themeColor="accent4" w:themeTint="99"/>
+          <w:sz w:val="32"/>
+          <w:szCs w:val="32"/>
         </w:rPr>
         <w:lastRenderedPageBreak/>
-        <w:t>[1, 2, 3, 4]</w:t>
-      </w:r>
-    </w:p>
-    <w:p>
-      <w:pPr>
-        <w:jc w:val="both"/>
-        <w:rPr>
-          <w:rFonts w:ascii="Carlito" w:hAnsi="Carlito" w:cs="Carlito"/>
+        <w:t>× [10,10,10,10]</w:t>
+      </w:r>
+    </w:p>
+    <w:p>
+      <w:pPr>
+        <w:jc w:val="both"/>
+        <w:rPr>
+          <w:rFonts w:cs="Carlito"/>
           <w:b/>
           <w:bCs/>
           <w:color w:val="60CAF3" w:themeColor="accent4" w:themeTint="99"/>
-          <w:sz w:val="34"/>
-          <w:szCs w:val="34"/>
-        </w:rPr>
-      </w:pPr>
-      <w:r>
-        <w:rPr>
-          <w:rFonts w:ascii="Carlito" w:hAnsi="Carlito" w:cs="Carlito"/>
+          <w:sz w:val="32"/>
+          <w:szCs w:val="32"/>
+        </w:rPr>
+      </w:pPr>
+      <w:r>
+        <w:rPr>
+          <w:rFonts w:cs="Carlito"/>
           <w:b/>
           <w:bCs/>
           <w:color w:val="60CAF3" w:themeColor="accent4" w:themeTint="99"/>
-          <w:sz w:val="34"/>
-          <w:szCs w:val="34"/>
-        </w:rPr>
-        <w:t>× [10,10,10,10]</w:t>
-      </w:r>
-    </w:p>
-    <w:p>
-      <w:pPr>
-        <w:jc w:val="both"/>
-        <w:rPr>
-          <w:rFonts w:ascii="Carlito" w:hAnsi="Carlito" w:cs="Carlito"/>
+          <w:sz w:val="32"/>
+          <w:szCs w:val="32"/>
+        </w:rPr>
+        <w:t>----------------</w:t>
+      </w:r>
+    </w:p>
+    <w:p>
+      <w:pPr>
+        <w:jc w:val="both"/>
+        <w:rPr>
+          <w:rFonts w:cs="Carlito"/>
           <w:b/>
           <w:bCs/>
           <w:color w:val="60CAF3" w:themeColor="accent4" w:themeTint="99"/>
-          <w:sz w:val="34"/>
-          <w:szCs w:val="34"/>
-        </w:rPr>
-      </w:pPr>
-      <w:r>
-        <w:rPr>
-          <w:rFonts w:ascii="Carlito" w:hAnsi="Carlito" w:cs="Carlito"/>
+          <w:sz w:val="32"/>
+          <w:szCs w:val="32"/>
+        </w:rPr>
+      </w:pPr>
+      <w:r>
+        <w:rPr>
+          <w:rFonts w:cs="Carlito"/>
           <w:b/>
           <w:bCs/>
           <w:color w:val="60CAF3" w:themeColor="accent4" w:themeTint="99"/>
-          <w:sz w:val="34"/>
-          <w:szCs w:val="34"/>
-        </w:rPr>
-        <w:t>----------------</w:t>
-      </w:r>
-    </w:p>
-    <w:p>
-      <w:pPr>
-        <w:jc w:val="both"/>
-        <w:rPr>
-          <w:rFonts w:ascii="Carlito" w:hAnsi="Carlito" w:cs="Carlito"/>
-          <w:b/>
-          <w:bCs/>
-          <w:color w:val="60CAF3" w:themeColor="accent4" w:themeTint="99"/>
-          <w:sz w:val="34"/>
-          <w:szCs w:val="34"/>
-        </w:rPr>
-      </w:pPr>
-      <w:r>
-        <w:rPr>
-          <w:rFonts w:ascii="Carlito" w:hAnsi="Carlito" w:cs="Carlito"/>
-          <w:b/>
-          <w:bCs/>
-          <w:color w:val="60CAF3" w:themeColor="accent4" w:themeTint="99"/>
-          <w:sz w:val="34"/>
-          <w:szCs w:val="34"/>
+          <w:sz w:val="32"/>
+          <w:szCs w:val="32"/>
         </w:rPr>
         <w:t>[10,20,30,40]</w:t>
       </w:r>
@@ -1498,16 +1498,16 @@
       <w:pPr>
         <w:jc w:val="both"/>
         <w:rPr>
-          <w:rFonts w:ascii="Carlito" w:hAnsi="Carlito" w:cs="Carlito"/>
-          <w:sz w:val="34"/>
-          <w:szCs w:val="34"/>
-        </w:rPr>
-      </w:pPr>
-      <w:r>
-        <w:rPr>
-          <w:rFonts w:ascii="Carlito" w:hAnsi="Carlito" w:cs="Carlito"/>
-          <w:sz w:val="34"/>
-          <w:szCs w:val="34"/>
+          <w:rFonts w:cs="Carlito"/>
+          <w:sz w:val="32"/>
+          <w:szCs w:val="32"/>
+        </w:rPr>
+      </w:pPr>
+      <w:r>
+        <w:rPr>
+          <w:rFonts w:cs="Carlito"/>
+          <w:sz w:val="32"/>
+          <w:szCs w:val="32"/>
         </w:rPr>
         <w:t># Code</w:t>
       </w:r>
@@ -1516,46 +1516,46 @@
       <w:pPr>
         <w:jc w:val="both"/>
         <w:rPr>
-          <w:rFonts w:ascii="Carlito" w:hAnsi="Carlito" w:cs="Carlito"/>
-          <w:b/>
-          <w:bCs/>
-          <w:color w:val="D86DCB" w:themeColor="accent5" w:themeTint="99"/>
-          <w:sz w:val="34"/>
-          <w:szCs w:val="34"/>
-        </w:rPr>
-      </w:pPr>
-      <w:r>
-        <w:rPr>
-          <w:rFonts w:ascii="Carlito" w:hAnsi="Carlito" w:cs="Carlito"/>
-          <w:b/>
-          <w:bCs/>
-          <w:color w:val="D86DCB" w:themeColor="accent5" w:themeTint="99"/>
-          <w:sz w:val="34"/>
-          <w:szCs w:val="34"/>
+          <w:rFonts w:cs="Carlito"/>
+          <w:b/>
+          <w:bCs/>
+          <w:color w:val="D86DCB" w:themeColor="accent5" w:themeTint="99"/>
+          <w:sz w:val="32"/>
+          <w:szCs w:val="32"/>
+        </w:rPr>
+      </w:pPr>
+      <w:r>
+        <w:rPr>
+          <w:rFonts w:cs="Carlito"/>
+          <w:b/>
+          <w:bCs/>
+          <w:color w:val="D86DCB" w:themeColor="accent5" w:themeTint="99"/>
+          <w:sz w:val="32"/>
+          <w:szCs w:val="32"/>
         </w:rPr>
         <w:t xml:space="preserve">import </w:t>
       </w:r>
       <w:proofErr w:type="spellStart"/>
       <w:r>
         <w:rPr>
-          <w:rFonts w:ascii="Carlito" w:hAnsi="Carlito" w:cs="Carlito"/>
-          <w:b/>
-          <w:bCs/>
-          <w:color w:val="D86DCB" w:themeColor="accent5" w:themeTint="99"/>
-          <w:sz w:val="34"/>
-          <w:szCs w:val="34"/>
+          <w:rFonts w:cs="Carlito"/>
+          <w:b/>
+          <w:bCs/>
+          <w:color w:val="D86DCB" w:themeColor="accent5" w:themeTint="99"/>
+          <w:sz w:val="32"/>
+          <w:szCs w:val="32"/>
         </w:rPr>
         <w:t>numpy</w:t>
       </w:r>
       <w:proofErr w:type="spellEnd"/>
       <w:r>
         <w:rPr>
-          <w:rFonts w:ascii="Carlito" w:hAnsi="Carlito" w:cs="Carlito"/>
-          <w:b/>
-          <w:bCs/>
-          <w:color w:val="D86DCB" w:themeColor="accent5" w:themeTint="99"/>
-          <w:sz w:val="34"/>
-          <w:szCs w:val="34"/>
+          <w:rFonts w:cs="Carlito"/>
+          <w:b/>
+          <w:bCs/>
+          <w:color w:val="D86DCB" w:themeColor="accent5" w:themeTint="99"/>
+          <w:sz w:val="32"/>
+          <w:szCs w:val="32"/>
         </w:rPr>
         <w:t xml:space="preserve"> as np</w:t>
       </w:r>
@@ -1564,22 +1564,22 @@
       <w:pPr>
         <w:jc w:val="both"/>
         <w:rPr>
-          <w:rFonts w:ascii="Carlito" w:hAnsi="Carlito" w:cs="Carlito"/>
-          <w:b/>
-          <w:bCs/>
-          <w:color w:val="D86DCB" w:themeColor="accent5" w:themeTint="99"/>
-          <w:sz w:val="34"/>
-          <w:szCs w:val="34"/>
-        </w:rPr>
-      </w:pPr>
-      <w:r>
-        <w:rPr>
-          <w:rFonts w:ascii="Carlito" w:hAnsi="Carlito" w:cs="Carlito"/>
-          <w:b/>
-          <w:bCs/>
-          <w:color w:val="D86DCB" w:themeColor="accent5" w:themeTint="99"/>
-          <w:sz w:val="34"/>
-          <w:szCs w:val="34"/>
+          <w:rFonts w:cs="Carlito"/>
+          <w:b/>
+          <w:bCs/>
+          <w:color w:val="D86DCB" w:themeColor="accent5" w:themeTint="99"/>
+          <w:sz w:val="32"/>
+          <w:szCs w:val="32"/>
+        </w:rPr>
+      </w:pPr>
+      <w:r>
+        <w:rPr>
+          <w:rFonts w:cs="Carlito"/>
+          <w:b/>
+          <w:bCs/>
+          <w:color w:val="D86DCB" w:themeColor="accent5" w:themeTint="99"/>
+          <w:sz w:val="32"/>
+          <w:szCs w:val="32"/>
         </w:rPr>
         <w:t xml:space="preserve">a = </w:t>
       </w:r>
@@ -1587,12 +1587,12 @@
       <w:proofErr w:type="gramStart"/>
       <w:r>
         <w:rPr>
-          <w:rFonts w:ascii="Carlito" w:hAnsi="Carlito" w:cs="Carlito"/>
-          <w:b/>
-          <w:bCs/>
-          <w:color w:val="D86DCB" w:themeColor="accent5" w:themeTint="99"/>
-          <w:sz w:val="34"/>
-          <w:szCs w:val="34"/>
+          <w:rFonts w:cs="Carlito"/>
+          <w:b/>
+          <w:bCs/>
+          <w:color w:val="D86DCB" w:themeColor="accent5" w:themeTint="99"/>
+          <w:sz w:val="32"/>
+          <w:szCs w:val="32"/>
         </w:rPr>
         <w:t>np.array</w:t>
       </w:r>
@@ -1600,12 +1600,12 @@
       <w:proofErr w:type="gramEnd"/>
       <w:r>
         <w:rPr>
-          <w:rFonts w:ascii="Carlito" w:hAnsi="Carlito" w:cs="Carlito"/>
-          <w:b/>
-          <w:bCs/>
-          <w:color w:val="D86DCB" w:themeColor="accent5" w:themeTint="99"/>
-          <w:sz w:val="34"/>
-          <w:szCs w:val="34"/>
+          <w:rFonts w:cs="Carlito"/>
+          <w:b/>
+          <w:bCs/>
+          <w:color w:val="D86DCB" w:themeColor="accent5" w:themeTint="99"/>
+          <w:sz w:val="32"/>
+          <w:szCs w:val="32"/>
         </w:rPr>
         <w:t>([1, 2, 3, 4])</w:t>
       </w:r>
@@ -1614,22 +1614,22 @@
       <w:pPr>
         <w:jc w:val="both"/>
         <w:rPr>
-          <w:rFonts w:ascii="Carlito" w:hAnsi="Carlito" w:cs="Carlito"/>
-          <w:b/>
-          <w:bCs/>
-          <w:color w:val="D86DCB" w:themeColor="accent5" w:themeTint="99"/>
-          <w:sz w:val="34"/>
-          <w:szCs w:val="34"/>
-        </w:rPr>
-      </w:pPr>
-      <w:r>
-        <w:rPr>
-          <w:rFonts w:ascii="Carlito" w:hAnsi="Carlito" w:cs="Carlito"/>
-          <w:b/>
-          <w:bCs/>
-          <w:color w:val="D86DCB" w:themeColor="accent5" w:themeTint="99"/>
-          <w:sz w:val="34"/>
-          <w:szCs w:val="34"/>
+          <w:rFonts w:cs="Carlito"/>
+          <w:b/>
+          <w:bCs/>
+          <w:color w:val="D86DCB" w:themeColor="accent5" w:themeTint="99"/>
+          <w:sz w:val="32"/>
+          <w:szCs w:val="32"/>
+        </w:rPr>
+      </w:pPr>
+      <w:r>
+        <w:rPr>
+          <w:rFonts w:cs="Carlito"/>
+          <w:b/>
+          <w:bCs/>
+          <w:color w:val="D86DCB" w:themeColor="accent5" w:themeTint="99"/>
+          <w:sz w:val="32"/>
+          <w:szCs w:val="32"/>
         </w:rPr>
         <w:t>scalar = 10</w:t>
       </w:r>
@@ -1638,22 +1638,22 @@
       <w:pPr>
         <w:jc w:val="both"/>
         <w:rPr>
-          <w:rFonts w:ascii="Carlito" w:hAnsi="Carlito" w:cs="Carlito"/>
-          <w:b/>
-          <w:bCs/>
-          <w:color w:val="D86DCB" w:themeColor="accent5" w:themeTint="99"/>
-          <w:sz w:val="34"/>
-          <w:szCs w:val="34"/>
-        </w:rPr>
-      </w:pPr>
-      <w:r>
-        <w:rPr>
-          <w:rFonts w:ascii="Carlito" w:hAnsi="Carlito" w:cs="Carlito"/>
-          <w:b/>
-          <w:bCs/>
-          <w:color w:val="D86DCB" w:themeColor="accent5" w:themeTint="99"/>
-          <w:sz w:val="34"/>
-          <w:szCs w:val="34"/>
+          <w:rFonts w:cs="Carlito"/>
+          <w:b/>
+          <w:bCs/>
+          <w:color w:val="D86DCB" w:themeColor="accent5" w:themeTint="99"/>
+          <w:sz w:val="32"/>
+          <w:szCs w:val="32"/>
+        </w:rPr>
+      </w:pPr>
+      <w:r>
+        <w:rPr>
+          <w:rFonts w:cs="Carlito"/>
+          <w:b/>
+          <w:bCs/>
+          <w:color w:val="D86DCB" w:themeColor="accent5" w:themeTint="99"/>
+          <w:sz w:val="32"/>
+          <w:szCs w:val="32"/>
         </w:rPr>
         <w:t>result = a * scalar</w:t>
       </w:r>
@@ -1662,22 +1662,22 @@
       <w:pPr>
         <w:jc w:val="both"/>
         <w:rPr>
-          <w:rFonts w:ascii="Carlito" w:hAnsi="Carlito" w:cs="Carlito"/>
-          <w:b/>
-          <w:bCs/>
-          <w:color w:val="D86DCB" w:themeColor="accent5" w:themeTint="99"/>
-          <w:sz w:val="34"/>
-          <w:szCs w:val="34"/>
-        </w:rPr>
-      </w:pPr>
-      <w:r>
-        <w:rPr>
-          <w:rFonts w:ascii="Carlito" w:hAnsi="Carlito" w:cs="Carlito"/>
-          <w:b/>
-          <w:bCs/>
-          <w:color w:val="D86DCB" w:themeColor="accent5" w:themeTint="99"/>
-          <w:sz w:val="34"/>
-          <w:szCs w:val="34"/>
+          <w:rFonts w:cs="Carlito"/>
+          <w:b/>
+          <w:bCs/>
+          <w:color w:val="D86DCB" w:themeColor="accent5" w:themeTint="99"/>
+          <w:sz w:val="32"/>
+          <w:szCs w:val="32"/>
+        </w:rPr>
+      </w:pPr>
+      <w:r>
+        <w:rPr>
+          <w:rFonts w:cs="Carlito"/>
+          <w:b/>
+          <w:bCs/>
+          <w:color w:val="D86DCB" w:themeColor="accent5" w:themeTint="99"/>
+          <w:sz w:val="32"/>
+          <w:szCs w:val="32"/>
         </w:rPr>
         <w:t>print(result)</w:t>
       </w:r>
@@ -1686,34 +1686,34 @@
       <w:pPr>
         <w:jc w:val="both"/>
         <w:rPr>
-          <w:rFonts w:ascii="Carlito" w:hAnsi="Carlito" w:cs="Carlito"/>
-          <w:sz w:val="34"/>
-          <w:szCs w:val="34"/>
-        </w:rPr>
-      </w:pPr>
-      <w:r>
-        <w:rPr>
-          <w:rFonts w:ascii="Carlito" w:hAnsi="Carlito" w:cs="Carlito"/>
-          <w:sz w:val="34"/>
-          <w:szCs w:val="34"/>
+          <w:rFonts w:cs="Carlito"/>
+          <w:sz w:val="32"/>
+          <w:szCs w:val="32"/>
+        </w:rPr>
+      </w:pPr>
+      <w:r>
+        <w:rPr>
+          <w:rFonts w:cs="Carlito"/>
+          <w:sz w:val="32"/>
+          <w:szCs w:val="32"/>
         </w:rPr>
         <w:t xml:space="preserve"># Rules of Broadcasting. When performing operations between arrays, </w:t>
       </w:r>
       <w:r>
         <w:rPr>
-          <w:rFonts w:ascii="Carlito" w:hAnsi="Carlito" w:cs="Carlito"/>
-          <w:b/>
-          <w:bCs/>
-          <w:sz w:val="34"/>
-          <w:szCs w:val="34"/>
+          <w:rFonts w:cs="Carlito"/>
+          <w:b/>
+          <w:bCs/>
+          <w:sz w:val="32"/>
+          <w:szCs w:val="32"/>
         </w:rPr>
         <w:t>NumPy</w:t>
       </w:r>
       <w:r>
         <w:rPr>
-          <w:rFonts w:ascii="Carlito" w:hAnsi="Carlito" w:cs="Carlito"/>
-          <w:sz w:val="34"/>
-          <w:szCs w:val="34"/>
+          <w:rFonts w:cs="Carlito"/>
+          <w:sz w:val="32"/>
+          <w:szCs w:val="32"/>
         </w:rPr>
         <w:t xml:space="preserve"> compares their shapes from right to left:</w:t>
       </w:r>
@@ -1727,16 +1727,16 @@
         </w:numPr>
         <w:jc w:val="both"/>
         <w:rPr>
-          <w:rFonts w:ascii="Carlito" w:hAnsi="Carlito" w:cs="Carlito"/>
-          <w:sz w:val="34"/>
-          <w:szCs w:val="34"/>
-        </w:rPr>
-      </w:pPr>
-      <w:r>
-        <w:rPr>
-          <w:rFonts w:ascii="Carlito" w:hAnsi="Carlito" w:cs="Carlito"/>
-          <w:sz w:val="34"/>
-          <w:szCs w:val="34"/>
+          <w:rFonts w:cs="Carlito"/>
+          <w:sz w:val="32"/>
+          <w:szCs w:val="32"/>
+        </w:rPr>
+      </w:pPr>
+      <w:r>
+        <w:rPr>
+          <w:rFonts w:cs="Carlito"/>
+          <w:sz w:val="32"/>
+          <w:szCs w:val="32"/>
         </w:rPr>
         <w:t>If the dimensions are equal, they’re compatible.</w:t>
       </w:r>
@@ -1750,16 +1750,16 @@
         </w:numPr>
         <w:jc w:val="both"/>
         <w:rPr>
-          <w:rFonts w:ascii="Carlito" w:hAnsi="Carlito" w:cs="Carlito"/>
-          <w:sz w:val="34"/>
-          <w:szCs w:val="34"/>
-        </w:rPr>
-      </w:pPr>
-      <w:r>
-        <w:rPr>
-          <w:rFonts w:ascii="Carlito" w:hAnsi="Carlito" w:cs="Carlito"/>
-          <w:sz w:val="34"/>
-          <w:szCs w:val="34"/>
+          <w:rFonts w:cs="Carlito"/>
+          <w:sz w:val="32"/>
+          <w:szCs w:val="32"/>
+        </w:rPr>
+      </w:pPr>
+      <w:r>
+        <w:rPr>
+          <w:rFonts w:cs="Carlito"/>
+          <w:sz w:val="32"/>
+          <w:szCs w:val="32"/>
         </w:rPr>
         <w:t>If one of them is 1, it’s stretched to match the other.</w:t>
       </w:r>
@@ -1773,32 +1773,32 @@
         </w:numPr>
         <w:jc w:val="both"/>
         <w:rPr>
-          <w:rFonts w:ascii="Carlito" w:hAnsi="Carlito" w:cs="Carlito"/>
-          <w:sz w:val="34"/>
-          <w:szCs w:val="34"/>
-        </w:rPr>
-      </w:pPr>
-      <w:r>
-        <w:rPr>
-          <w:rFonts w:ascii="Carlito" w:hAnsi="Carlito" w:cs="Carlito"/>
-          <w:sz w:val="34"/>
-          <w:szCs w:val="34"/>
+          <w:rFonts w:cs="Carlito"/>
+          <w:sz w:val="32"/>
+          <w:szCs w:val="32"/>
+        </w:rPr>
+      </w:pPr>
+      <w:r>
+        <w:rPr>
+          <w:rFonts w:cs="Carlito"/>
+          <w:sz w:val="32"/>
+          <w:szCs w:val="32"/>
         </w:rPr>
         <w:t xml:space="preserve">If they differ and neither is 1, </w:t>
       </w:r>
       <w:r>
         <w:rPr>
           <w:rFonts w:ascii="Segoe UI Emoji" w:hAnsi="Segoe UI Emoji" w:cs="Segoe UI Emoji"/>
-          <w:sz w:val="34"/>
-          <w:szCs w:val="34"/>
+          <w:sz w:val="32"/>
+          <w:szCs w:val="32"/>
         </w:rPr>
         <w:t>❌</w:t>
       </w:r>
       <w:r>
         <w:rPr>
-          <w:rFonts w:ascii="Carlito" w:hAnsi="Carlito" w:cs="Carlito"/>
-          <w:sz w:val="34"/>
-          <w:szCs w:val="34"/>
+          <w:rFonts w:cs="Carlito"/>
+          <w:sz w:val="32"/>
+          <w:szCs w:val="32"/>
         </w:rPr>
         <w:t xml:space="preserve"> error (cannot broadcast).</w:t>
       </w:r>
@@ -1807,16 +1807,16 @@
       <w:pPr>
         <w:jc w:val="both"/>
         <w:rPr>
-          <w:rFonts w:ascii="Carlito" w:hAnsi="Carlito" w:cs="Carlito"/>
-          <w:sz w:val="34"/>
-          <w:szCs w:val="34"/>
-        </w:rPr>
-      </w:pPr>
-      <w:r>
-        <w:rPr>
-          <w:rFonts w:ascii="Carlito" w:hAnsi="Carlito" w:cs="Carlito"/>
-          <w:sz w:val="34"/>
-          <w:szCs w:val="34"/>
+          <w:rFonts w:cs="Carlito"/>
+          <w:sz w:val="32"/>
+          <w:szCs w:val="32"/>
+        </w:rPr>
+      </w:pPr>
+      <w:r>
+        <w:rPr>
+          <w:rFonts w:cs="Carlito"/>
+          <w:sz w:val="32"/>
+          <w:szCs w:val="32"/>
         </w:rPr>
         <w:t>Note: Broadcasting can happen with different shapes.</w:t>
       </w:r>
@@ -1825,52 +1825,52 @@
       <w:pPr>
         <w:jc w:val="both"/>
         <w:rPr>
-          <w:rFonts w:ascii="Carlito" w:hAnsi="Carlito" w:cs="Carlito"/>
-          <w:sz w:val="34"/>
-          <w:szCs w:val="34"/>
-        </w:rPr>
-      </w:pPr>
-    </w:p>
-    <w:p>
-      <w:pPr>
-        <w:jc w:val="both"/>
-        <w:rPr>
-          <w:rFonts w:ascii="Carlito" w:hAnsi="Carlito" w:cs="Carlito"/>
-          <w:b/>
-          <w:bCs/>
-          <w:sz w:val="34"/>
-          <w:szCs w:val="34"/>
-        </w:rPr>
-      </w:pPr>
-      <w:r>
-        <w:rPr>
-          <w:rFonts w:ascii="Carlito" w:hAnsi="Carlito" w:cs="Carlito"/>
-          <w:b/>
-          <w:bCs/>
-          <w:sz w:val="34"/>
-          <w:szCs w:val="34"/>
+          <w:rFonts w:cs="Carlito"/>
+          <w:sz w:val="32"/>
+          <w:szCs w:val="32"/>
+        </w:rPr>
+      </w:pPr>
+    </w:p>
+    <w:p>
+      <w:pPr>
+        <w:jc w:val="both"/>
+        <w:rPr>
+          <w:rFonts w:cs="Carlito"/>
+          <w:b/>
+          <w:bCs/>
+          <w:sz w:val="32"/>
+          <w:szCs w:val="32"/>
+        </w:rPr>
+      </w:pPr>
+      <w:r>
+        <w:rPr>
+          <w:rFonts w:cs="Carlito"/>
+          <w:b/>
+          <w:bCs/>
+          <w:sz w:val="32"/>
+          <w:szCs w:val="32"/>
         </w:rPr>
         <w:t xml:space="preserve">Random Number Generation in </w:t>
       </w:r>
       <w:proofErr w:type="spellStart"/>
       <w:r>
         <w:rPr>
-          <w:rFonts w:ascii="Carlito" w:hAnsi="Carlito" w:cs="Carlito"/>
-          <w:b/>
-          <w:bCs/>
-          <w:sz w:val="34"/>
-          <w:szCs w:val="34"/>
+          <w:rFonts w:cs="Carlito"/>
+          <w:b/>
+          <w:bCs/>
+          <w:sz w:val="32"/>
+          <w:szCs w:val="32"/>
         </w:rPr>
         <w:t>Numpy</w:t>
       </w:r>
       <w:proofErr w:type="spellEnd"/>
       <w:r>
         <w:rPr>
-          <w:rFonts w:ascii="Carlito" w:hAnsi="Carlito" w:cs="Carlito"/>
-          <w:b/>
-          <w:bCs/>
-          <w:sz w:val="34"/>
-          <w:szCs w:val="34"/>
+          <w:rFonts w:cs="Carlito"/>
+          <w:b/>
+          <w:bCs/>
+          <w:sz w:val="32"/>
+          <w:szCs w:val="32"/>
         </w:rPr>
         <w:t>:</w:t>
       </w:r>
@@ -1879,24 +1879,24 @@
       <w:pPr>
         <w:jc w:val="both"/>
         <w:rPr>
-          <w:rFonts w:ascii="Carlito" w:hAnsi="Carlito" w:cs="Carlito"/>
-          <w:sz w:val="34"/>
-          <w:szCs w:val="34"/>
-        </w:rPr>
-      </w:pPr>
-      <w:r>
-        <w:rPr>
-          <w:rFonts w:ascii="Carlito" w:hAnsi="Carlito" w:cs="Carlito"/>
-          <w:sz w:val="34"/>
-          <w:szCs w:val="34"/>
+          <w:rFonts w:cs="Carlito"/>
+          <w:sz w:val="32"/>
+          <w:szCs w:val="32"/>
+        </w:rPr>
+      </w:pPr>
+      <w:r>
+        <w:rPr>
+          <w:rFonts w:cs="Carlito"/>
+          <w:sz w:val="32"/>
+          <w:szCs w:val="32"/>
         </w:rPr>
         <w:t xml:space="preserve"># </w:t>
       </w:r>
       <w:r>
         <w:rPr>
-          <w:rFonts w:ascii="Carlito" w:hAnsi="Carlito" w:cs="Carlito"/>
-          <w:sz w:val="34"/>
-          <w:szCs w:val="34"/>
+          <w:rFonts w:cs="Carlito"/>
+          <w:sz w:val="32"/>
+          <w:szCs w:val="32"/>
         </w:rPr>
         <w:t>Random number generation means creating numbers that appear random that is, they follow a statistical distribution (like uniform, normal, etc.). In ML, random numbers are often used for:</w:t>
       </w:r>
@@ -1910,16 +1910,16 @@
         </w:numPr>
         <w:jc w:val="both"/>
         <w:rPr>
-          <w:rFonts w:ascii="Carlito" w:hAnsi="Carlito" w:cs="Carlito"/>
-          <w:sz w:val="34"/>
-          <w:szCs w:val="34"/>
-        </w:rPr>
-      </w:pPr>
-      <w:r>
-        <w:rPr>
-          <w:rFonts w:ascii="Carlito" w:hAnsi="Carlito" w:cs="Carlito"/>
-          <w:sz w:val="34"/>
-          <w:szCs w:val="34"/>
+          <w:rFonts w:cs="Carlito"/>
+          <w:sz w:val="32"/>
+          <w:szCs w:val="32"/>
+        </w:rPr>
+      </w:pPr>
+      <w:r>
+        <w:rPr>
+          <w:rFonts w:cs="Carlito"/>
+          <w:sz w:val="32"/>
+          <w:szCs w:val="32"/>
         </w:rPr>
         <w:t>Splitting datasets (train/test)</w:t>
       </w:r>
@@ -1933,16 +1933,16 @@
         </w:numPr>
         <w:jc w:val="both"/>
         <w:rPr>
-          <w:rFonts w:ascii="Carlito" w:hAnsi="Carlito" w:cs="Carlito"/>
-          <w:sz w:val="34"/>
-          <w:szCs w:val="34"/>
-        </w:rPr>
-      </w:pPr>
-      <w:r>
-        <w:rPr>
-          <w:rFonts w:ascii="Carlito" w:hAnsi="Carlito" w:cs="Carlito"/>
-          <w:sz w:val="34"/>
-          <w:szCs w:val="34"/>
+          <w:rFonts w:cs="Carlito"/>
+          <w:sz w:val="32"/>
+          <w:szCs w:val="32"/>
+        </w:rPr>
+      </w:pPr>
+      <w:r>
+        <w:rPr>
+          <w:rFonts w:cs="Carlito"/>
+          <w:sz w:val="32"/>
+          <w:szCs w:val="32"/>
         </w:rPr>
         <w:t>Initializing model weights</w:t>
       </w:r>
@@ -1956,77 +1956,77 @@
         </w:numPr>
         <w:jc w:val="both"/>
         <w:rPr>
-          <w:rFonts w:ascii="Carlito" w:hAnsi="Carlito" w:cs="Carlito"/>
-          <w:sz w:val="34"/>
-          <w:szCs w:val="34"/>
-        </w:rPr>
-      </w:pPr>
-      <w:r>
-        <w:rPr>
-          <w:rFonts w:ascii="Carlito" w:hAnsi="Carlito" w:cs="Carlito"/>
-          <w:sz w:val="34"/>
-          <w:szCs w:val="34"/>
+          <w:rFonts w:cs="Carlito"/>
+          <w:sz w:val="32"/>
+          <w:szCs w:val="32"/>
+        </w:rPr>
+      </w:pPr>
+      <w:r>
+        <w:rPr>
+          <w:rFonts w:cs="Carlito"/>
+          <w:sz w:val="32"/>
+          <w:szCs w:val="32"/>
+        </w:rPr>
+        <w:t>Random sampling (e.g., in stochastic gradient descent)</w:t>
+      </w:r>
+    </w:p>
+    <w:p>
+      <w:pPr>
+        <w:jc w:val="both"/>
+        <w:rPr>
+          <w:rFonts w:cs="Carlito"/>
+          <w:sz w:val="32"/>
+          <w:szCs w:val="32"/>
+        </w:rPr>
+      </w:pPr>
+      <w:r>
+        <w:rPr>
+          <w:rFonts w:cs="Carlito"/>
+          <w:sz w:val="32"/>
+          <w:szCs w:val="32"/>
         </w:rPr>
         <w:lastRenderedPageBreak/>
-        <w:t>Random sampling (e.g., in stochastic gradient descent)</w:t>
-      </w:r>
-    </w:p>
-    <w:p>
-      <w:pPr>
-        <w:jc w:val="both"/>
-        <w:rPr>
-          <w:rFonts w:ascii="Carlito" w:hAnsi="Carlito" w:cs="Carlito"/>
-          <w:sz w:val="34"/>
-          <w:szCs w:val="34"/>
-        </w:rPr>
-      </w:pPr>
-      <w:r>
-        <w:rPr>
-          <w:rFonts w:ascii="Carlito" w:hAnsi="Carlito" w:cs="Carlito"/>
-          <w:sz w:val="34"/>
-          <w:szCs w:val="34"/>
-        </w:rPr>
         <w:t xml:space="preserve"># </w:t>
       </w:r>
       <w:proofErr w:type="spellStart"/>
       <w:proofErr w:type="gramStart"/>
       <w:r>
         <w:rPr>
-          <w:rFonts w:ascii="Carlito" w:hAnsi="Carlito" w:cs="Carlito"/>
-          <w:b/>
-          <w:bCs/>
-          <w:sz w:val="34"/>
-          <w:szCs w:val="34"/>
+          <w:rFonts w:cs="Carlito"/>
+          <w:b/>
+          <w:bCs/>
+          <w:sz w:val="32"/>
+          <w:szCs w:val="32"/>
         </w:rPr>
         <w:t>np.random</w:t>
       </w:r>
       <w:proofErr w:type="gramEnd"/>
       <w:r>
         <w:rPr>
-          <w:rFonts w:ascii="Carlito" w:hAnsi="Carlito" w:cs="Carlito"/>
-          <w:b/>
-          <w:bCs/>
-          <w:sz w:val="34"/>
-          <w:szCs w:val="34"/>
+          <w:rFonts w:cs="Carlito"/>
+          <w:b/>
+          <w:bCs/>
+          <w:sz w:val="32"/>
+          <w:szCs w:val="32"/>
         </w:rPr>
         <w:t>.uniform</w:t>
       </w:r>
       <w:proofErr w:type="spellEnd"/>
       <w:r>
         <w:rPr>
-          <w:rFonts w:ascii="Carlito" w:hAnsi="Carlito" w:cs="Carlito"/>
-          <w:b/>
-          <w:bCs/>
-          <w:sz w:val="34"/>
-          <w:szCs w:val="34"/>
+          <w:rFonts w:cs="Carlito"/>
+          <w:b/>
+          <w:bCs/>
+          <w:sz w:val="32"/>
+          <w:szCs w:val="32"/>
         </w:rPr>
         <w:t>()</w:t>
       </w:r>
       <w:r>
         <w:rPr>
-          <w:rFonts w:ascii="Carlito" w:hAnsi="Carlito" w:cs="Carlito"/>
-          <w:sz w:val="34"/>
-          <w:szCs w:val="34"/>
+          <w:rFonts w:cs="Carlito"/>
+          <w:sz w:val="32"/>
+          <w:szCs w:val="32"/>
         </w:rPr>
         <w:t xml:space="preserve"> this function generates random numbers from a uniform distribution. A uniform distribution means every number in a given range has an equal probability of appearing.</w:t>
       </w:r>
@@ -2035,52 +2035,52 @@
       <w:pPr>
         <w:jc w:val="both"/>
         <w:rPr>
-          <w:rFonts w:ascii="Carlito" w:hAnsi="Carlito" w:cs="Carlito"/>
-          <w:sz w:val="34"/>
-          <w:szCs w:val="34"/>
-        </w:rPr>
-      </w:pPr>
-      <w:r>
-        <w:rPr>
-          <w:rFonts w:ascii="Carlito" w:hAnsi="Carlito" w:cs="Carlito"/>
-          <w:sz w:val="34"/>
-          <w:szCs w:val="34"/>
+          <w:rFonts w:cs="Carlito"/>
+          <w:sz w:val="32"/>
+          <w:szCs w:val="32"/>
+        </w:rPr>
+      </w:pPr>
+      <w:r>
+        <w:rPr>
+          <w:rFonts w:cs="Carlito"/>
+          <w:sz w:val="32"/>
+          <w:szCs w:val="32"/>
         </w:rPr>
         <w:t xml:space="preserve"># </w:t>
       </w:r>
       <w:r>
         <w:rPr>
-          <w:rFonts w:ascii="Carlito" w:hAnsi="Carlito" w:cs="Carlito"/>
-          <w:b/>
-          <w:bCs/>
-          <w:sz w:val="34"/>
-          <w:szCs w:val="34"/>
+          <w:rFonts w:cs="Carlito"/>
+          <w:b/>
+          <w:bCs/>
+          <w:sz w:val="32"/>
+          <w:szCs w:val="32"/>
         </w:rPr>
         <w:t xml:space="preserve">size=5 </w:t>
       </w:r>
       <w:r>
         <w:rPr>
-          <w:rFonts w:ascii="Carlito" w:hAnsi="Carlito" w:cs="Carlito"/>
-          <w:sz w:val="34"/>
-          <w:szCs w:val="34"/>
+          <w:rFonts w:cs="Carlito"/>
+          <w:sz w:val="32"/>
+          <w:szCs w:val="32"/>
         </w:rPr>
         <w:t xml:space="preserve">this tells </w:t>
       </w:r>
       <w:r>
         <w:rPr>
-          <w:rFonts w:ascii="Carlito" w:hAnsi="Carlito" w:cs="Carlito"/>
-          <w:b/>
-          <w:bCs/>
-          <w:sz w:val="34"/>
-          <w:szCs w:val="34"/>
+          <w:rFonts w:cs="Carlito"/>
+          <w:b/>
+          <w:bCs/>
+          <w:sz w:val="32"/>
+          <w:szCs w:val="32"/>
         </w:rPr>
         <w:t>NumPy</w:t>
       </w:r>
       <w:r>
         <w:rPr>
-          <w:rFonts w:ascii="Carlito" w:hAnsi="Carlito" w:cs="Carlito"/>
-          <w:sz w:val="34"/>
-          <w:szCs w:val="34"/>
+          <w:rFonts w:cs="Carlito"/>
+          <w:sz w:val="32"/>
+          <w:szCs w:val="32"/>
         </w:rPr>
         <w:t xml:space="preserve"> to generate 5 random numbers.</w:t>
       </w:r>
@@ -2089,196 +2089,196 @@
       <w:pPr>
         <w:jc w:val="both"/>
         <w:rPr>
-          <w:rFonts w:ascii="Carlito" w:hAnsi="Carlito" w:cs="Carlito"/>
-          <w:sz w:val="34"/>
-          <w:szCs w:val="34"/>
-        </w:rPr>
-      </w:pPr>
-      <w:r>
-        <w:rPr>
-          <w:rFonts w:ascii="Carlito" w:hAnsi="Carlito" w:cs="Carlito"/>
-          <w:sz w:val="34"/>
-          <w:szCs w:val="34"/>
+          <w:rFonts w:cs="Carlito"/>
+          <w:sz w:val="32"/>
+          <w:szCs w:val="32"/>
+        </w:rPr>
+      </w:pPr>
+      <w:r>
+        <w:rPr>
+          <w:rFonts w:cs="Carlito"/>
+          <w:sz w:val="32"/>
+          <w:szCs w:val="32"/>
         </w:rPr>
         <w:t xml:space="preserve"># </w:t>
       </w:r>
       <w:r>
         <w:rPr>
-          <w:rFonts w:ascii="Carlito" w:hAnsi="Carlito" w:cs="Carlito"/>
-          <w:sz w:val="34"/>
-          <w:szCs w:val="34"/>
+          <w:rFonts w:cs="Carlito"/>
+          <w:sz w:val="32"/>
+          <w:szCs w:val="32"/>
         </w:rPr>
         <w:t xml:space="preserve">By </w:t>
       </w:r>
       <w:proofErr w:type="gramStart"/>
       <w:r>
         <w:rPr>
-          <w:rFonts w:ascii="Carlito" w:hAnsi="Carlito" w:cs="Carlito"/>
-          <w:sz w:val="34"/>
-          <w:szCs w:val="34"/>
+          <w:rFonts w:cs="Carlito"/>
+          <w:sz w:val="32"/>
+          <w:szCs w:val="32"/>
         </w:rPr>
         <w:t>default</w:t>
       </w:r>
       <w:proofErr w:type="gramEnd"/>
       <w:r>
         <w:rPr>
-          <w:rFonts w:ascii="Carlito" w:hAnsi="Carlito" w:cs="Carlito"/>
-          <w:sz w:val="34"/>
-          <w:szCs w:val="34"/>
+          <w:rFonts w:cs="Carlito"/>
+          <w:sz w:val="32"/>
+          <w:szCs w:val="32"/>
         </w:rPr>
         <w:t xml:space="preserve"> r</w:t>
       </w:r>
       <w:r>
         <w:rPr>
-          <w:rFonts w:ascii="Carlito" w:hAnsi="Carlito" w:cs="Carlito"/>
-          <w:sz w:val="34"/>
-          <w:szCs w:val="34"/>
+          <w:rFonts w:cs="Carlito"/>
+          <w:sz w:val="32"/>
+          <w:szCs w:val="32"/>
         </w:rPr>
         <w:t xml:space="preserve">ange is </w:t>
       </w:r>
       <w:r>
         <w:rPr>
-          <w:rFonts w:ascii="Carlito" w:hAnsi="Carlito" w:cs="Carlito"/>
-          <w:b/>
-          <w:bCs/>
-          <w:sz w:val="34"/>
-          <w:szCs w:val="34"/>
+          <w:rFonts w:cs="Carlito"/>
+          <w:b/>
+          <w:bCs/>
+          <w:sz w:val="32"/>
+          <w:szCs w:val="32"/>
         </w:rPr>
         <w:t>(</w:t>
       </w:r>
       <w:r>
         <w:rPr>
-          <w:rFonts w:ascii="Carlito" w:hAnsi="Carlito" w:cs="Carlito"/>
-          <w:b/>
-          <w:bCs/>
-          <w:sz w:val="34"/>
-          <w:szCs w:val="34"/>
+          <w:rFonts w:cs="Carlito"/>
+          <w:b/>
+          <w:bCs/>
+          <w:sz w:val="32"/>
+          <w:szCs w:val="32"/>
         </w:rPr>
         <w:t>0.0, 1.0)</w:t>
       </w:r>
       <w:r>
         <w:rPr>
-          <w:rFonts w:ascii="Carlito" w:hAnsi="Carlito" w:cs="Carlito"/>
-          <w:sz w:val="34"/>
-          <w:szCs w:val="34"/>
+          <w:rFonts w:cs="Carlito"/>
+          <w:sz w:val="32"/>
+          <w:szCs w:val="32"/>
         </w:rPr>
         <w:t xml:space="preserve"> includes 0.0, excludes 1.0.</w:t>
       </w:r>
       <w:r>
         <w:rPr>
-          <w:rFonts w:ascii="Carlito" w:hAnsi="Carlito" w:cs="Carlito"/>
-          <w:sz w:val="34"/>
-          <w:szCs w:val="34"/>
+          <w:rFonts w:cs="Carlito"/>
+          <w:sz w:val="32"/>
+          <w:szCs w:val="32"/>
         </w:rPr>
         <w:t xml:space="preserve"> </w:t>
       </w:r>
       <w:r>
         <w:rPr>
-          <w:rFonts w:ascii="Carlito" w:hAnsi="Carlito" w:cs="Carlito"/>
-          <w:sz w:val="34"/>
-          <w:szCs w:val="34"/>
+          <w:rFonts w:cs="Carlito"/>
+          <w:sz w:val="32"/>
+          <w:szCs w:val="32"/>
         </w:rPr>
         <w:t>We</w:t>
       </w:r>
       <w:r>
         <w:rPr>
-          <w:rFonts w:ascii="Carlito" w:hAnsi="Carlito" w:cs="Carlito"/>
-          <w:sz w:val="34"/>
-          <w:szCs w:val="34"/>
+          <w:rFonts w:cs="Carlito"/>
+          <w:sz w:val="32"/>
+          <w:szCs w:val="32"/>
         </w:rPr>
         <w:t xml:space="preserve"> can change the range using </w:t>
       </w:r>
       <w:r>
         <w:rPr>
-          <w:rFonts w:ascii="Carlito" w:hAnsi="Carlito" w:cs="Carlito"/>
-          <w:b/>
-          <w:bCs/>
-          <w:sz w:val="34"/>
-          <w:szCs w:val="34"/>
+          <w:rFonts w:cs="Carlito"/>
+          <w:b/>
+          <w:bCs/>
+          <w:sz w:val="32"/>
+          <w:szCs w:val="32"/>
         </w:rPr>
         <w:t>low</w:t>
       </w:r>
       <w:r>
         <w:rPr>
-          <w:rFonts w:ascii="Carlito" w:hAnsi="Carlito" w:cs="Carlito"/>
-          <w:b/>
-          <w:bCs/>
-          <w:sz w:val="34"/>
-          <w:szCs w:val="34"/>
+          <w:rFonts w:cs="Carlito"/>
+          <w:b/>
+          <w:bCs/>
+          <w:sz w:val="32"/>
+          <w:szCs w:val="32"/>
         </w:rPr>
         <w:t>=</w:t>
       </w:r>
       <w:r>
         <w:rPr>
-          <w:rFonts w:ascii="Carlito" w:hAnsi="Carlito" w:cs="Carlito"/>
-          <w:sz w:val="34"/>
-          <w:szCs w:val="34"/>
+          <w:rFonts w:cs="Carlito"/>
+          <w:sz w:val="32"/>
+          <w:szCs w:val="32"/>
         </w:rPr>
         <w:t xml:space="preserve"> and </w:t>
       </w:r>
       <w:r>
         <w:rPr>
-          <w:rFonts w:ascii="Carlito" w:hAnsi="Carlito" w:cs="Carlito"/>
-          <w:b/>
-          <w:bCs/>
-          <w:sz w:val="34"/>
-          <w:szCs w:val="34"/>
+          <w:rFonts w:cs="Carlito"/>
+          <w:b/>
+          <w:bCs/>
+          <w:sz w:val="32"/>
+          <w:szCs w:val="32"/>
         </w:rPr>
         <w:t>high</w:t>
       </w:r>
       <w:proofErr w:type="gramStart"/>
       <w:r>
         <w:rPr>
-          <w:rFonts w:ascii="Carlito" w:hAnsi="Carlito" w:cs="Carlito"/>
-          <w:b/>
-          <w:bCs/>
-          <w:sz w:val="34"/>
-          <w:szCs w:val="34"/>
+          <w:rFonts w:cs="Carlito"/>
+          <w:b/>
+          <w:bCs/>
+          <w:sz w:val="32"/>
+          <w:szCs w:val="32"/>
         </w:rPr>
         <w:t xml:space="preserve">= </w:t>
       </w:r>
       <w:r>
         <w:rPr>
-          <w:rFonts w:ascii="Carlito" w:hAnsi="Carlito" w:cs="Carlito"/>
-          <w:sz w:val="34"/>
-          <w:szCs w:val="34"/>
+          <w:rFonts w:cs="Carlito"/>
+          <w:sz w:val="32"/>
+          <w:szCs w:val="32"/>
         </w:rPr>
         <w:t xml:space="preserve"> parameter</w:t>
       </w:r>
       <w:proofErr w:type="gramEnd"/>
       <w:r>
         <w:rPr>
-          <w:rFonts w:ascii="Carlito" w:hAnsi="Carlito" w:cs="Carlito"/>
-          <w:sz w:val="34"/>
-          <w:szCs w:val="34"/>
+          <w:rFonts w:cs="Carlito"/>
+          <w:sz w:val="32"/>
+          <w:szCs w:val="32"/>
         </w:rPr>
         <w:t xml:space="preserve"> in</w:t>
       </w:r>
       <w:r>
         <w:rPr>
-          <w:rFonts w:ascii="Carlito" w:hAnsi="Carlito" w:cs="Carlito"/>
-          <w:b/>
-          <w:bCs/>
-          <w:sz w:val="34"/>
-          <w:szCs w:val="34"/>
+          <w:rFonts w:cs="Carlito"/>
+          <w:b/>
+          <w:bCs/>
+          <w:sz w:val="32"/>
+          <w:szCs w:val="32"/>
         </w:rPr>
         <w:t xml:space="preserve"> </w:t>
       </w:r>
       <w:r>
         <w:rPr>
-          <w:rFonts w:ascii="Carlito" w:hAnsi="Carlito" w:cs="Carlito"/>
-          <w:b/>
-          <w:bCs/>
-          <w:sz w:val="34"/>
-          <w:szCs w:val="34"/>
+          <w:rFonts w:cs="Carlito"/>
+          <w:b/>
+          <w:bCs/>
+          <w:sz w:val="32"/>
+          <w:szCs w:val="32"/>
         </w:rPr>
         <w:t>.uniform()</w:t>
       </w:r>
       <w:r>
         <w:rPr>
-          <w:rFonts w:ascii="Carlito" w:hAnsi="Carlito" w:cs="Carlito"/>
-          <w:sz w:val="34"/>
-          <w:szCs w:val="34"/>
+          <w:rFonts w:cs="Carlito"/>
+          <w:sz w:val="32"/>
+          <w:szCs w:val="32"/>
         </w:rPr>
         <w:t>.</w:t>
       </w:r>
@@ -2287,46 +2287,46 @@
       <w:pPr>
         <w:jc w:val="both"/>
         <w:rPr>
-          <w:rFonts w:ascii="Carlito" w:hAnsi="Carlito" w:cs="Carlito"/>
-          <w:b/>
-          <w:bCs/>
-          <w:color w:val="D86DCB" w:themeColor="accent5" w:themeTint="99"/>
-          <w:sz w:val="34"/>
-          <w:szCs w:val="34"/>
-        </w:rPr>
-      </w:pPr>
-      <w:r>
-        <w:rPr>
-          <w:rFonts w:ascii="Carlito" w:hAnsi="Carlito" w:cs="Carlito"/>
-          <w:b/>
-          <w:bCs/>
-          <w:color w:val="D86DCB" w:themeColor="accent5" w:themeTint="99"/>
-          <w:sz w:val="34"/>
-          <w:szCs w:val="34"/>
+          <w:rFonts w:cs="Carlito"/>
+          <w:b/>
+          <w:bCs/>
+          <w:color w:val="D86DCB" w:themeColor="accent5" w:themeTint="99"/>
+          <w:sz w:val="32"/>
+          <w:szCs w:val="32"/>
+        </w:rPr>
+      </w:pPr>
+      <w:r>
+        <w:rPr>
+          <w:rFonts w:cs="Carlito"/>
+          <w:b/>
+          <w:bCs/>
+          <w:color w:val="D86DCB" w:themeColor="accent5" w:themeTint="99"/>
+          <w:sz w:val="32"/>
+          <w:szCs w:val="32"/>
         </w:rPr>
         <w:t xml:space="preserve">import </w:t>
       </w:r>
       <w:proofErr w:type="spellStart"/>
       <w:r>
         <w:rPr>
-          <w:rFonts w:ascii="Carlito" w:hAnsi="Carlito" w:cs="Carlito"/>
-          <w:b/>
-          <w:bCs/>
-          <w:color w:val="D86DCB" w:themeColor="accent5" w:themeTint="99"/>
-          <w:sz w:val="34"/>
-          <w:szCs w:val="34"/>
+          <w:rFonts w:cs="Carlito"/>
+          <w:b/>
+          <w:bCs/>
+          <w:color w:val="D86DCB" w:themeColor="accent5" w:themeTint="99"/>
+          <w:sz w:val="32"/>
+          <w:szCs w:val="32"/>
         </w:rPr>
         <w:t>numpy</w:t>
       </w:r>
       <w:proofErr w:type="spellEnd"/>
       <w:r>
         <w:rPr>
-          <w:rFonts w:ascii="Carlito" w:hAnsi="Carlito" w:cs="Carlito"/>
-          <w:b/>
-          <w:bCs/>
-          <w:color w:val="D86DCB" w:themeColor="accent5" w:themeTint="99"/>
-          <w:sz w:val="34"/>
-          <w:szCs w:val="34"/>
+          <w:rFonts w:cs="Carlito"/>
+          <w:b/>
+          <w:bCs/>
+          <w:color w:val="D86DCB" w:themeColor="accent5" w:themeTint="99"/>
+          <w:sz w:val="32"/>
+          <w:szCs w:val="32"/>
         </w:rPr>
         <w:t xml:space="preserve"> as np</w:t>
       </w:r>
@@ -2335,35 +2335,35 @@
       <w:pPr>
         <w:jc w:val="both"/>
         <w:rPr>
-          <w:rFonts w:ascii="Carlito" w:hAnsi="Carlito" w:cs="Carlito"/>
-          <w:b/>
-          <w:bCs/>
-          <w:color w:val="D86DCB" w:themeColor="accent5" w:themeTint="99"/>
-          <w:sz w:val="34"/>
-          <w:szCs w:val="34"/>
+          <w:rFonts w:cs="Carlito"/>
+          <w:b/>
+          <w:bCs/>
+          <w:color w:val="D86DCB" w:themeColor="accent5" w:themeTint="99"/>
+          <w:sz w:val="32"/>
+          <w:szCs w:val="32"/>
         </w:rPr>
       </w:pPr>
       <w:proofErr w:type="spellStart"/>
       <w:r>
         <w:rPr>
-          <w:rFonts w:ascii="Carlito" w:hAnsi="Carlito" w:cs="Carlito"/>
-          <w:b/>
-          <w:bCs/>
-          <w:color w:val="D86DCB" w:themeColor="accent5" w:themeTint="99"/>
-          <w:sz w:val="34"/>
-          <w:szCs w:val="34"/>
+          <w:rFonts w:cs="Carlito"/>
+          <w:b/>
+          <w:bCs/>
+          <w:color w:val="D86DCB" w:themeColor="accent5" w:themeTint="99"/>
+          <w:sz w:val="32"/>
+          <w:szCs w:val="32"/>
         </w:rPr>
         <w:t>random_numbers</w:t>
       </w:r>
       <w:proofErr w:type="spellEnd"/>
       <w:r>
         <w:rPr>
-          <w:rFonts w:ascii="Carlito" w:hAnsi="Carlito" w:cs="Carlito"/>
-          <w:b/>
-          <w:bCs/>
-          <w:color w:val="D86DCB" w:themeColor="accent5" w:themeTint="99"/>
-          <w:sz w:val="34"/>
-          <w:szCs w:val="34"/>
+          <w:rFonts w:cs="Carlito"/>
+          <w:b/>
+          <w:bCs/>
+          <w:color w:val="D86DCB" w:themeColor="accent5" w:themeTint="99"/>
+          <w:sz w:val="32"/>
+          <w:szCs w:val="32"/>
         </w:rPr>
         <w:t xml:space="preserve"> = </w:t>
       </w:r>
@@ -2371,36 +2371,36 @@
       <w:proofErr w:type="gramStart"/>
       <w:r>
         <w:rPr>
-          <w:rFonts w:ascii="Carlito" w:hAnsi="Carlito" w:cs="Carlito"/>
-          <w:b/>
-          <w:bCs/>
-          <w:color w:val="D86DCB" w:themeColor="accent5" w:themeTint="99"/>
-          <w:sz w:val="34"/>
-          <w:szCs w:val="34"/>
+          <w:rFonts w:cs="Carlito"/>
+          <w:b/>
+          <w:bCs/>
+          <w:color w:val="D86DCB" w:themeColor="accent5" w:themeTint="99"/>
+          <w:sz w:val="32"/>
+          <w:szCs w:val="32"/>
         </w:rPr>
         <w:t>np.random</w:t>
       </w:r>
       <w:proofErr w:type="gramEnd"/>
       <w:r>
         <w:rPr>
-          <w:rFonts w:ascii="Carlito" w:hAnsi="Carlito" w:cs="Carlito"/>
-          <w:b/>
-          <w:bCs/>
-          <w:color w:val="D86DCB" w:themeColor="accent5" w:themeTint="99"/>
-          <w:sz w:val="34"/>
-          <w:szCs w:val="34"/>
+          <w:rFonts w:cs="Carlito"/>
+          <w:b/>
+          <w:bCs/>
+          <w:color w:val="D86DCB" w:themeColor="accent5" w:themeTint="99"/>
+          <w:sz w:val="32"/>
+          <w:szCs w:val="32"/>
         </w:rPr>
         <w:t>.uniform</w:t>
       </w:r>
       <w:proofErr w:type="spellEnd"/>
       <w:r>
         <w:rPr>
-          <w:rFonts w:ascii="Carlito" w:hAnsi="Carlito" w:cs="Carlito"/>
-          <w:b/>
-          <w:bCs/>
-          <w:color w:val="D86DCB" w:themeColor="accent5" w:themeTint="99"/>
-          <w:sz w:val="34"/>
-          <w:szCs w:val="34"/>
+          <w:rFonts w:cs="Carlito"/>
+          <w:b/>
+          <w:bCs/>
+          <w:color w:val="D86DCB" w:themeColor="accent5" w:themeTint="99"/>
+          <w:sz w:val="32"/>
+          <w:szCs w:val="32"/>
         </w:rPr>
         <w:t>(size=5)</w:t>
       </w:r>
@@ -2409,46 +2409,46 @@
       <w:pPr>
         <w:jc w:val="both"/>
         <w:rPr>
-          <w:rFonts w:ascii="Carlito" w:hAnsi="Carlito" w:cs="Carlito"/>
-          <w:b/>
-          <w:bCs/>
-          <w:color w:val="D86DCB" w:themeColor="accent5" w:themeTint="99"/>
-          <w:sz w:val="34"/>
-          <w:szCs w:val="34"/>
-        </w:rPr>
-      </w:pPr>
-      <w:r>
-        <w:rPr>
-          <w:rFonts w:ascii="Carlito" w:hAnsi="Carlito" w:cs="Carlito"/>
-          <w:b/>
-          <w:bCs/>
-          <w:color w:val="D86DCB" w:themeColor="accent5" w:themeTint="99"/>
-          <w:sz w:val="34"/>
-          <w:szCs w:val="34"/>
+          <w:rFonts w:cs="Carlito"/>
+          <w:b/>
+          <w:bCs/>
+          <w:color w:val="D86DCB" w:themeColor="accent5" w:themeTint="99"/>
+          <w:sz w:val="32"/>
+          <w:szCs w:val="32"/>
+        </w:rPr>
+      </w:pPr>
+      <w:r>
+        <w:rPr>
+          <w:rFonts w:cs="Carlito"/>
+          <w:b/>
+          <w:bCs/>
+          <w:color w:val="D86DCB" w:themeColor="accent5" w:themeTint="99"/>
+          <w:sz w:val="32"/>
+          <w:szCs w:val="32"/>
         </w:rPr>
         <w:t>print(</w:t>
       </w:r>
       <w:proofErr w:type="spellStart"/>
       <w:r>
         <w:rPr>
-          <w:rFonts w:ascii="Carlito" w:hAnsi="Carlito" w:cs="Carlito"/>
-          <w:b/>
-          <w:bCs/>
-          <w:color w:val="D86DCB" w:themeColor="accent5" w:themeTint="99"/>
-          <w:sz w:val="34"/>
-          <w:szCs w:val="34"/>
+          <w:rFonts w:cs="Carlito"/>
+          <w:b/>
+          <w:bCs/>
+          <w:color w:val="D86DCB" w:themeColor="accent5" w:themeTint="99"/>
+          <w:sz w:val="32"/>
+          <w:szCs w:val="32"/>
         </w:rPr>
         <w:t>random_numbers</w:t>
       </w:r>
       <w:proofErr w:type="spellEnd"/>
       <w:r>
         <w:rPr>
-          <w:rFonts w:ascii="Carlito" w:hAnsi="Carlito" w:cs="Carlito"/>
-          <w:b/>
-          <w:bCs/>
-          <w:color w:val="D86DCB" w:themeColor="accent5" w:themeTint="99"/>
-          <w:sz w:val="34"/>
-          <w:szCs w:val="34"/>
+          <w:rFonts w:cs="Carlito"/>
+          <w:b/>
+          <w:bCs/>
+          <w:color w:val="D86DCB" w:themeColor="accent5" w:themeTint="99"/>
+          <w:sz w:val="32"/>
+          <w:szCs w:val="32"/>
         </w:rPr>
         <w:t>)</w:t>
       </w:r>
@@ -2457,52 +2457,52 @@
       <w:pPr>
         <w:jc w:val="both"/>
         <w:rPr>
-          <w:rFonts w:ascii="Carlito" w:hAnsi="Carlito" w:cs="Carlito"/>
-          <w:sz w:val="34"/>
-          <w:szCs w:val="34"/>
-        </w:rPr>
-      </w:pPr>
-    </w:p>
-    <w:p>
-      <w:pPr>
-        <w:jc w:val="both"/>
-        <w:rPr>
-          <w:rFonts w:ascii="Carlito" w:hAnsi="Carlito" w:cs="Carlito"/>
-          <w:b/>
-          <w:bCs/>
-          <w:sz w:val="34"/>
-          <w:szCs w:val="34"/>
-        </w:rPr>
-      </w:pPr>
-      <w:r>
-        <w:rPr>
-          <w:rFonts w:ascii="Carlito" w:hAnsi="Carlito" w:cs="Carlito"/>
-          <w:b/>
-          <w:bCs/>
-          <w:sz w:val="34"/>
-          <w:szCs w:val="34"/>
+          <w:rFonts w:cs="Carlito"/>
+          <w:sz w:val="32"/>
+          <w:szCs w:val="32"/>
+        </w:rPr>
+      </w:pPr>
+    </w:p>
+    <w:p>
+      <w:pPr>
+        <w:jc w:val="both"/>
+        <w:rPr>
+          <w:rFonts w:cs="Carlito"/>
+          <w:b/>
+          <w:bCs/>
+          <w:sz w:val="32"/>
+          <w:szCs w:val="32"/>
+        </w:rPr>
+      </w:pPr>
+      <w:r>
+        <w:rPr>
+          <w:rFonts w:cs="Carlito"/>
+          <w:b/>
+          <w:bCs/>
+          <w:sz w:val="32"/>
+          <w:szCs w:val="32"/>
         </w:rPr>
         <w:t xml:space="preserve">Matrix Dot Multiplication using </w:t>
       </w:r>
       <w:proofErr w:type="spellStart"/>
       <w:r>
         <w:rPr>
-          <w:rFonts w:ascii="Carlito" w:hAnsi="Carlito" w:cs="Carlito"/>
-          <w:b/>
-          <w:bCs/>
-          <w:sz w:val="34"/>
-          <w:szCs w:val="34"/>
+          <w:rFonts w:cs="Carlito"/>
+          <w:b/>
+          <w:bCs/>
+          <w:sz w:val="32"/>
+          <w:szCs w:val="32"/>
         </w:rPr>
         <w:t>Numpy</w:t>
       </w:r>
       <w:proofErr w:type="spellEnd"/>
       <w:r>
         <w:rPr>
-          <w:rFonts w:ascii="Carlito" w:hAnsi="Carlito" w:cs="Carlito"/>
-          <w:b/>
-          <w:bCs/>
-          <w:sz w:val="34"/>
-          <w:szCs w:val="34"/>
+          <w:rFonts w:cs="Carlito"/>
+          <w:b/>
+          <w:bCs/>
+          <w:sz w:val="32"/>
+          <w:szCs w:val="32"/>
         </w:rPr>
         <w:t>:</w:t>
       </w:r>
@@ -2511,62 +2511,62 @@
       <w:pPr>
         <w:jc w:val="both"/>
         <w:rPr>
-          <w:rFonts w:ascii="Carlito" w:hAnsi="Carlito" w:cs="Carlito"/>
-          <w:sz w:val="34"/>
-          <w:szCs w:val="34"/>
-        </w:rPr>
-      </w:pPr>
-      <w:r>
-        <w:rPr>
-          <w:rFonts w:ascii="Carlito" w:hAnsi="Carlito" w:cs="Carlito"/>
-          <w:sz w:val="34"/>
-          <w:szCs w:val="34"/>
+          <w:rFonts w:cs="Carlito"/>
+          <w:sz w:val="32"/>
+          <w:szCs w:val="32"/>
+        </w:rPr>
+      </w:pPr>
+      <w:r>
+        <w:rPr>
+          <w:rFonts w:cs="Carlito"/>
+          <w:sz w:val="32"/>
+          <w:szCs w:val="32"/>
         </w:rPr>
         <w:t xml:space="preserve"># </w:t>
       </w:r>
       <w:r>
         <w:rPr>
-          <w:rFonts w:ascii="Carlito" w:hAnsi="Carlito" w:cs="Carlito"/>
-          <w:sz w:val="34"/>
-          <w:szCs w:val="34"/>
+          <w:rFonts w:cs="Carlito"/>
+          <w:sz w:val="32"/>
+          <w:szCs w:val="32"/>
         </w:rPr>
         <w:t>To multiply matrices A and B. The number of columns in A must equal the number of rows in B.</w:t>
       </w:r>
       <w:r>
         <w:rPr>
-          <w:rFonts w:ascii="Carlito" w:hAnsi="Carlito" w:cs="Carlito"/>
-          <w:sz w:val="34"/>
-          <w:szCs w:val="34"/>
+          <w:rFonts w:cs="Carlito"/>
+          <w:sz w:val="32"/>
+          <w:szCs w:val="32"/>
         </w:rPr>
         <w:t xml:space="preserve"> </w:t>
       </w:r>
       <w:proofErr w:type="gramStart"/>
       <w:r>
         <w:rPr>
-          <w:rFonts w:ascii="Carlito" w:hAnsi="Carlito" w:cs="Carlito"/>
-          <w:b/>
-          <w:bCs/>
-          <w:sz w:val="34"/>
-          <w:szCs w:val="34"/>
+          <w:rFonts w:cs="Carlito"/>
+          <w:b/>
+          <w:bCs/>
+          <w:sz w:val="32"/>
+          <w:szCs w:val="32"/>
         </w:rPr>
         <w:t>np.dot(</w:t>
       </w:r>
       <w:proofErr w:type="gramEnd"/>
       <w:r>
         <w:rPr>
-          <w:rFonts w:ascii="Carlito" w:hAnsi="Carlito" w:cs="Carlito"/>
-          <w:b/>
-          <w:bCs/>
-          <w:sz w:val="34"/>
-          <w:szCs w:val="34"/>
+          <w:rFonts w:cs="Carlito"/>
+          <w:b/>
+          <w:bCs/>
+          <w:sz w:val="32"/>
+          <w:szCs w:val="32"/>
         </w:rPr>
         <w:t>)</w:t>
       </w:r>
       <w:r>
         <w:rPr>
-          <w:rFonts w:ascii="Carlito" w:hAnsi="Carlito" w:cs="Carlito"/>
-          <w:sz w:val="34"/>
-          <w:szCs w:val="34"/>
+          <w:rFonts w:cs="Carlito"/>
+          <w:sz w:val="32"/>
+          <w:szCs w:val="32"/>
         </w:rPr>
         <w:t xml:space="preserve"> method multiplies these two matrices.</w:t>
       </w:r>
@@ -2575,46 +2575,46 @@
       <w:pPr>
         <w:jc w:val="both"/>
         <w:rPr>
-          <w:rFonts w:ascii="Carlito" w:hAnsi="Carlito" w:cs="Carlito"/>
-          <w:b/>
-          <w:bCs/>
-          <w:color w:val="D86DCB" w:themeColor="accent5" w:themeTint="99"/>
-          <w:sz w:val="34"/>
-          <w:szCs w:val="34"/>
-        </w:rPr>
-      </w:pPr>
-      <w:r>
-        <w:rPr>
-          <w:rFonts w:ascii="Carlito" w:hAnsi="Carlito" w:cs="Carlito"/>
-          <w:b/>
-          <w:bCs/>
-          <w:color w:val="D86DCB" w:themeColor="accent5" w:themeTint="99"/>
-          <w:sz w:val="34"/>
-          <w:szCs w:val="34"/>
+          <w:rFonts w:cs="Carlito"/>
+          <w:b/>
+          <w:bCs/>
+          <w:color w:val="D86DCB" w:themeColor="accent5" w:themeTint="99"/>
+          <w:sz w:val="32"/>
+          <w:szCs w:val="32"/>
+        </w:rPr>
+      </w:pPr>
+      <w:r>
+        <w:rPr>
+          <w:rFonts w:cs="Carlito"/>
+          <w:b/>
+          <w:bCs/>
+          <w:color w:val="D86DCB" w:themeColor="accent5" w:themeTint="99"/>
+          <w:sz w:val="32"/>
+          <w:szCs w:val="32"/>
         </w:rPr>
         <w:t xml:space="preserve">import </w:t>
       </w:r>
       <w:proofErr w:type="spellStart"/>
       <w:r>
         <w:rPr>
-          <w:rFonts w:ascii="Carlito" w:hAnsi="Carlito" w:cs="Carlito"/>
-          <w:b/>
-          <w:bCs/>
-          <w:color w:val="D86DCB" w:themeColor="accent5" w:themeTint="99"/>
-          <w:sz w:val="34"/>
-          <w:szCs w:val="34"/>
+          <w:rFonts w:cs="Carlito"/>
+          <w:b/>
+          <w:bCs/>
+          <w:color w:val="D86DCB" w:themeColor="accent5" w:themeTint="99"/>
+          <w:sz w:val="32"/>
+          <w:szCs w:val="32"/>
         </w:rPr>
         <w:t>numpy</w:t>
       </w:r>
       <w:proofErr w:type="spellEnd"/>
       <w:r>
         <w:rPr>
-          <w:rFonts w:ascii="Carlito" w:hAnsi="Carlito" w:cs="Carlito"/>
-          <w:b/>
-          <w:bCs/>
-          <w:color w:val="D86DCB" w:themeColor="accent5" w:themeTint="99"/>
-          <w:sz w:val="34"/>
-          <w:szCs w:val="34"/>
+          <w:rFonts w:cs="Carlito"/>
+          <w:b/>
+          <w:bCs/>
+          <w:color w:val="D86DCB" w:themeColor="accent5" w:themeTint="99"/>
+          <w:sz w:val="32"/>
+          <w:szCs w:val="32"/>
         </w:rPr>
         <w:t xml:space="preserve"> as np</w:t>
       </w:r>
@@ -2623,22 +2623,22 @@
       <w:pPr>
         <w:jc w:val="both"/>
         <w:rPr>
-          <w:rFonts w:ascii="Carlito" w:hAnsi="Carlito" w:cs="Carlito"/>
-          <w:b/>
-          <w:bCs/>
-          <w:color w:val="D86DCB" w:themeColor="accent5" w:themeTint="99"/>
-          <w:sz w:val="34"/>
-          <w:szCs w:val="34"/>
-        </w:rPr>
-      </w:pPr>
-      <w:r>
-        <w:rPr>
-          <w:rFonts w:ascii="Carlito" w:hAnsi="Carlito" w:cs="Carlito"/>
-          <w:b/>
-          <w:bCs/>
-          <w:color w:val="D86DCB" w:themeColor="accent5" w:themeTint="99"/>
-          <w:sz w:val="34"/>
-          <w:szCs w:val="34"/>
+          <w:rFonts w:cs="Carlito"/>
+          <w:b/>
+          <w:bCs/>
+          <w:color w:val="D86DCB" w:themeColor="accent5" w:themeTint="99"/>
+          <w:sz w:val="32"/>
+          <w:szCs w:val="32"/>
+        </w:rPr>
+      </w:pPr>
+      <w:r>
+        <w:rPr>
+          <w:rFonts w:cs="Carlito"/>
+          <w:b/>
+          <w:bCs/>
+          <w:color w:val="D86DCB" w:themeColor="accent5" w:themeTint="99"/>
+          <w:sz w:val="32"/>
+          <w:szCs w:val="32"/>
         </w:rPr>
         <w:t xml:space="preserve">a = </w:t>
       </w:r>
@@ -2646,12 +2646,12 @@
       <w:proofErr w:type="gramStart"/>
       <w:r>
         <w:rPr>
-          <w:rFonts w:ascii="Carlito" w:hAnsi="Carlito" w:cs="Carlito"/>
-          <w:b/>
-          <w:bCs/>
-          <w:color w:val="D86DCB" w:themeColor="accent5" w:themeTint="99"/>
-          <w:sz w:val="34"/>
-          <w:szCs w:val="34"/>
+          <w:rFonts w:cs="Carlito"/>
+          <w:b/>
+          <w:bCs/>
+          <w:color w:val="D86DCB" w:themeColor="accent5" w:themeTint="99"/>
+          <w:sz w:val="32"/>
+          <w:szCs w:val="32"/>
         </w:rPr>
         <w:t>np.array</w:t>
       </w:r>
@@ -2659,12 +2659,12 @@
       <w:proofErr w:type="gramEnd"/>
       <w:r>
         <w:rPr>
-          <w:rFonts w:ascii="Carlito" w:hAnsi="Carlito" w:cs="Carlito"/>
-          <w:b/>
-          <w:bCs/>
-          <w:color w:val="D86DCB" w:themeColor="accent5" w:themeTint="99"/>
-          <w:sz w:val="34"/>
-          <w:szCs w:val="34"/>
+          <w:rFonts w:cs="Carlito"/>
+          <w:b/>
+          <w:bCs/>
+          <w:color w:val="D86DCB" w:themeColor="accent5" w:themeTint="99"/>
+          <w:sz w:val="32"/>
+          <w:szCs w:val="32"/>
         </w:rPr>
         <w:t>([[1, 2],</w:t>
       </w:r>
@@ -2673,22 +2673,22 @@
       <w:pPr>
         <w:jc w:val="both"/>
         <w:rPr>
-          <w:rFonts w:ascii="Carlito" w:hAnsi="Carlito" w:cs="Carlito"/>
-          <w:b/>
-          <w:bCs/>
-          <w:color w:val="D86DCB" w:themeColor="accent5" w:themeTint="99"/>
-          <w:sz w:val="34"/>
-          <w:szCs w:val="34"/>
-        </w:rPr>
-      </w:pPr>
-      <w:r>
-        <w:rPr>
-          <w:rFonts w:ascii="Carlito" w:hAnsi="Carlito" w:cs="Carlito"/>
-          <w:b/>
-          <w:bCs/>
-          <w:color w:val="D86DCB" w:themeColor="accent5" w:themeTint="99"/>
-          <w:sz w:val="34"/>
-          <w:szCs w:val="34"/>
+          <w:rFonts w:cs="Carlito"/>
+          <w:b/>
+          <w:bCs/>
+          <w:color w:val="D86DCB" w:themeColor="accent5" w:themeTint="99"/>
+          <w:sz w:val="32"/>
+          <w:szCs w:val="32"/>
+        </w:rPr>
+      </w:pPr>
+      <w:r>
+        <w:rPr>
+          <w:rFonts w:cs="Carlito"/>
+          <w:b/>
+          <w:bCs/>
+          <w:color w:val="D86DCB" w:themeColor="accent5" w:themeTint="99"/>
+          <w:sz w:val="32"/>
+          <w:szCs w:val="32"/>
         </w:rPr>
         <w:t xml:space="preserve">              [3, 4]])</w:t>
       </w:r>
@@ -2697,22 +2697,22 @@
       <w:pPr>
         <w:jc w:val="both"/>
         <w:rPr>
-          <w:rFonts w:ascii="Carlito" w:hAnsi="Carlito" w:cs="Carlito"/>
-          <w:b/>
-          <w:bCs/>
-          <w:color w:val="D86DCB" w:themeColor="accent5" w:themeTint="99"/>
-          <w:sz w:val="34"/>
-          <w:szCs w:val="34"/>
-        </w:rPr>
-      </w:pPr>
-      <w:r>
-        <w:rPr>
-          <w:rFonts w:ascii="Carlito" w:hAnsi="Carlito" w:cs="Carlito"/>
-          <w:b/>
-          <w:bCs/>
-          <w:color w:val="D86DCB" w:themeColor="accent5" w:themeTint="99"/>
-          <w:sz w:val="34"/>
-          <w:szCs w:val="34"/>
+          <w:rFonts w:cs="Carlito"/>
+          <w:b/>
+          <w:bCs/>
+          <w:color w:val="D86DCB" w:themeColor="accent5" w:themeTint="99"/>
+          <w:sz w:val="32"/>
+          <w:szCs w:val="32"/>
+        </w:rPr>
+      </w:pPr>
+      <w:r>
+        <w:rPr>
+          <w:rFonts w:cs="Carlito"/>
+          <w:b/>
+          <w:bCs/>
+          <w:color w:val="D86DCB" w:themeColor="accent5" w:themeTint="99"/>
+          <w:sz w:val="32"/>
+          <w:szCs w:val="32"/>
         </w:rPr>
         <w:t xml:space="preserve">b = </w:t>
       </w:r>
@@ -2720,12 +2720,12 @@
       <w:proofErr w:type="gramStart"/>
       <w:r>
         <w:rPr>
-          <w:rFonts w:ascii="Carlito" w:hAnsi="Carlito" w:cs="Carlito"/>
-          <w:b/>
-          <w:bCs/>
-          <w:color w:val="D86DCB" w:themeColor="accent5" w:themeTint="99"/>
-          <w:sz w:val="34"/>
-          <w:szCs w:val="34"/>
+          <w:rFonts w:cs="Carlito"/>
+          <w:b/>
+          <w:bCs/>
+          <w:color w:val="D86DCB" w:themeColor="accent5" w:themeTint="99"/>
+          <w:sz w:val="32"/>
+          <w:szCs w:val="32"/>
         </w:rPr>
         <w:t>np.array</w:t>
       </w:r>
@@ -2733,12 +2733,12 @@
       <w:proofErr w:type="gramEnd"/>
       <w:r>
         <w:rPr>
-          <w:rFonts w:ascii="Carlito" w:hAnsi="Carlito" w:cs="Carlito"/>
-          <w:b/>
-          <w:bCs/>
-          <w:color w:val="D86DCB" w:themeColor="accent5" w:themeTint="99"/>
-          <w:sz w:val="34"/>
-          <w:szCs w:val="34"/>
+          <w:rFonts w:cs="Carlito"/>
+          <w:b/>
+          <w:bCs/>
+          <w:color w:val="D86DCB" w:themeColor="accent5" w:themeTint="99"/>
+          <w:sz w:val="32"/>
+          <w:szCs w:val="32"/>
         </w:rPr>
         <w:t>([[5, 6],</w:t>
       </w:r>
@@ -2747,22 +2747,22 @@
       <w:pPr>
         <w:jc w:val="both"/>
         <w:rPr>
-          <w:rFonts w:ascii="Carlito" w:hAnsi="Carlito" w:cs="Carlito"/>
-          <w:b/>
-          <w:bCs/>
-          <w:color w:val="D86DCB" w:themeColor="accent5" w:themeTint="99"/>
-          <w:sz w:val="34"/>
-          <w:szCs w:val="34"/>
-        </w:rPr>
-      </w:pPr>
-      <w:r>
-        <w:rPr>
-          <w:rFonts w:ascii="Carlito" w:hAnsi="Carlito" w:cs="Carlito"/>
-          <w:b/>
-          <w:bCs/>
-          <w:color w:val="D86DCB" w:themeColor="accent5" w:themeTint="99"/>
-          <w:sz w:val="34"/>
-          <w:szCs w:val="34"/>
+          <w:rFonts w:cs="Carlito"/>
+          <w:b/>
+          <w:bCs/>
+          <w:color w:val="D86DCB" w:themeColor="accent5" w:themeTint="99"/>
+          <w:sz w:val="32"/>
+          <w:szCs w:val="32"/>
+        </w:rPr>
+      </w:pPr>
+      <w:r>
+        <w:rPr>
+          <w:rFonts w:cs="Carlito"/>
+          <w:b/>
+          <w:bCs/>
+          <w:color w:val="D86DCB" w:themeColor="accent5" w:themeTint="99"/>
+          <w:sz w:val="32"/>
+          <w:szCs w:val="32"/>
         </w:rPr>
         <w:t xml:space="preserve">              [7, 8]])</w:t>
       </w:r>
@@ -2771,46 +2771,46 @@
       <w:pPr>
         <w:jc w:val="both"/>
         <w:rPr>
-          <w:rFonts w:ascii="Carlito" w:hAnsi="Carlito" w:cs="Carlito"/>
-          <w:b/>
-          <w:bCs/>
-          <w:color w:val="D86DCB" w:themeColor="accent5" w:themeTint="99"/>
-          <w:sz w:val="34"/>
-          <w:szCs w:val="34"/>
-        </w:rPr>
-      </w:pPr>
-      <w:r>
-        <w:rPr>
-          <w:rFonts w:ascii="Carlito" w:hAnsi="Carlito" w:cs="Carlito"/>
-          <w:b/>
-          <w:bCs/>
-          <w:color w:val="D86DCB" w:themeColor="accent5" w:themeTint="99"/>
-          <w:sz w:val="34"/>
-          <w:szCs w:val="34"/>
+          <w:rFonts w:cs="Carlito"/>
+          <w:b/>
+          <w:bCs/>
+          <w:color w:val="D86DCB" w:themeColor="accent5" w:themeTint="99"/>
+          <w:sz w:val="32"/>
+          <w:szCs w:val="32"/>
+        </w:rPr>
+      </w:pPr>
+      <w:r>
+        <w:rPr>
+          <w:rFonts w:cs="Carlito"/>
+          <w:b/>
+          <w:bCs/>
+          <w:color w:val="D86DCB" w:themeColor="accent5" w:themeTint="99"/>
+          <w:sz w:val="32"/>
+          <w:szCs w:val="32"/>
         </w:rPr>
         <w:t xml:space="preserve">result = </w:t>
       </w:r>
       <w:proofErr w:type="gramStart"/>
       <w:r>
         <w:rPr>
-          <w:rFonts w:ascii="Carlito" w:hAnsi="Carlito" w:cs="Carlito"/>
-          <w:b/>
-          <w:bCs/>
-          <w:color w:val="D86DCB" w:themeColor="accent5" w:themeTint="99"/>
-          <w:sz w:val="34"/>
-          <w:szCs w:val="34"/>
+          <w:rFonts w:cs="Carlito"/>
+          <w:b/>
+          <w:bCs/>
+          <w:color w:val="D86DCB" w:themeColor="accent5" w:themeTint="99"/>
+          <w:sz w:val="32"/>
+          <w:szCs w:val="32"/>
         </w:rPr>
         <w:t>np.dot(</w:t>
       </w:r>
       <w:proofErr w:type="gramEnd"/>
       <w:r>
         <w:rPr>
-          <w:rFonts w:ascii="Carlito" w:hAnsi="Carlito" w:cs="Carlito"/>
-          <w:b/>
-          <w:bCs/>
-          <w:color w:val="D86DCB" w:themeColor="accent5" w:themeTint="99"/>
-          <w:sz w:val="34"/>
-          <w:szCs w:val="34"/>
+          <w:rFonts w:cs="Carlito"/>
+          <w:b/>
+          <w:bCs/>
+          <w:color w:val="D86DCB" w:themeColor="accent5" w:themeTint="99"/>
+          <w:sz w:val="32"/>
+          <w:szCs w:val="32"/>
         </w:rPr>
         <w:t>a, b)</w:t>
       </w:r>
@@ -2819,22 +2819,22 @@
       <w:pPr>
         <w:jc w:val="both"/>
         <w:rPr>
-          <w:rFonts w:ascii="Carlito" w:hAnsi="Carlito" w:cs="Carlito"/>
-          <w:b/>
-          <w:bCs/>
-          <w:color w:val="D86DCB" w:themeColor="accent5" w:themeTint="99"/>
-          <w:sz w:val="34"/>
-          <w:szCs w:val="34"/>
-        </w:rPr>
-      </w:pPr>
-      <w:r>
-        <w:rPr>
-          <w:rFonts w:ascii="Carlito" w:hAnsi="Carlito" w:cs="Carlito"/>
-          <w:b/>
-          <w:bCs/>
-          <w:color w:val="D86DCB" w:themeColor="accent5" w:themeTint="99"/>
-          <w:sz w:val="34"/>
-          <w:szCs w:val="34"/>
+          <w:rFonts w:cs="Carlito"/>
+          <w:b/>
+          <w:bCs/>
+          <w:color w:val="D86DCB" w:themeColor="accent5" w:themeTint="99"/>
+          <w:sz w:val="32"/>
+          <w:szCs w:val="32"/>
+        </w:rPr>
+      </w:pPr>
+      <w:r>
+        <w:rPr>
+          <w:rFonts w:cs="Carlito"/>
+          <w:b/>
+          <w:bCs/>
+          <w:color w:val="D86DCB" w:themeColor="accent5" w:themeTint="99"/>
+          <w:sz w:val="32"/>
+          <w:szCs w:val="32"/>
         </w:rPr>
         <w:t>print(result)</w:t>
       </w:r>
@@ -2843,66 +2843,66 @@
       <w:pPr>
         <w:jc w:val="both"/>
         <w:rPr>
-          <w:rFonts w:ascii="Carlito" w:hAnsi="Carlito" w:cs="Carlito"/>
-          <w:b/>
-          <w:bCs/>
-          <w:sz w:val="34"/>
-          <w:szCs w:val="34"/>
-        </w:rPr>
-      </w:pPr>
-      <w:r>
-        <w:rPr>
-          <w:rFonts w:ascii="Carlito" w:hAnsi="Carlito" w:cs="Carlito"/>
-          <w:sz w:val="34"/>
-          <w:szCs w:val="34"/>
+          <w:rFonts w:cs="Carlito"/>
+          <w:b/>
+          <w:bCs/>
+          <w:sz w:val="32"/>
+          <w:szCs w:val="32"/>
+        </w:rPr>
+      </w:pPr>
+      <w:r>
+        <w:rPr>
+          <w:rFonts w:cs="Carlito"/>
+          <w:sz w:val="32"/>
+          <w:szCs w:val="32"/>
         </w:rPr>
         <w:t xml:space="preserve"># Short hand of this is </w:t>
       </w:r>
       <w:r>
         <w:rPr>
-          <w:rFonts w:ascii="Carlito" w:hAnsi="Carlito" w:cs="Carlito"/>
-          <w:sz w:val="34"/>
-          <w:szCs w:val="34"/>
+          <w:rFonts w:cs="Carlito"/>
+          <w:sz w:val="32"/>
+          <w:szCs w:val="32"/>
         </w:rPr>
         <w:t xml:space="preserve">just using </w:t>
       </w:r>
       <w:r>
         <w:rPr>
-          <w:rFonts w:ascii="Carlito" w:hAnsi="Carlito" w:cs="Carlito"/>
-          <w:b/>
-          <w:bCs/>
-          <w:sz w:val="34"/>
-          <w:szCs w:val="34"/>
+          <w:rFonts w:cs="Carlito"/>
+          <w:b/>
+          <w:bCs/>
+          <w:sz w:val="32"/>
+          <w:szCs w:val="32"/>
         </w:rPr>
         <w:t>@</w:t>
       </w:r>
       <w:r>
         <w:rPr>
-          <w:rFonts w:ascii="Carlito" w:hAnsi="Carlito" w:cs="Carlito"/>
-          <w:sz w:val="34"/>
-          <w:szCs w:val="34"/>
+          <w:rFonts w:cs="Carlito"/>
+          <w:sz w:val="32"/>
+          <w:szCs w:val="32"/>
         </w:rPr>
         <w:t xml:space="preserve">. Same as </w:t>
       </w:r>
       <w:proofErr w:type="gramStart"/>
       <w:r>
         <w:rPr>
-          <w:rFonts w:ascii="Carlito" w:hAnsi="Carlito" w:cs="Carlito"/>
-          <w:b/>
-          <w:bCs/>
-          <w:sz w:val="34"/>
-          <w:szCs w:val="34"/>
+          <w:rFonts w:cs="Carlito"/>
+          <w:b/>
+          <w:bCs/>
+          <w:sz w:val="32"/>
+          <w:szCs w:val="32"/>
         </w:rPr>
         <w:t>np.dot(</w:t>
       </w:r>
       <w:proofErr w:type="gramEnd"/>
       <w:r>
         <w:rPr>
-          <w:rFonts w:ascii="Carlito" w:hAnsi="Carlito" w:cs="Carlito"/>
-          <w:b/>
-          <w:bCs/>
-          <w:sz w:val="34"/>
-          <w:szCs w:val="34"/>
+          <w:rFonts w:cs="Carlito"/>
+          <w:b/>
+          <w:bCs/>
+          <w:sz w:val="32"/>
+          <w:szCs w:val="32"/>
         </w:rPr>
         <w:t>a, b)</w:t>
       </w:r>
@@ -2911,24 +2911,23 @@
       <w:pPr>
         <w:jc w:val="both"/>
         <w:rPr>
-          <w:rFonts w:ascii="Carlito" w:hAnsi="Carlito" w:cs="Carlito"/>
-          <w:b/>
-          <w:bCs/>
-          <w:color w:val="D86DCB" w:themeColor="accent5" w:themeTint="99"/>
-          <w:sz w:val="34"/>
-          <w:szCs w:val="34"/>
-        </w:rPr>
-      </w:pPr>
-      <w:r>
-        <w:rPr>
-          <w:rFonts w:ascii="Carlito" w:hAnsi="Carlito" w:cs="Carlito"/>
-          <w:b/>
-          <w:bCs/>
-          <w:color w:val="D86DCB" w:themeColor="accent5" w:themeTint="99"/>
-          <w:sz w:val="34"/>
-          <w:szCs w:val="34"/>
-        </w:rPr>
-        <w:lastRenderedPageBreak/>
+          <w:rFonts w:cs="Carlito"/>
+          <w:b/>
+          <w:bCs/>
+          <w:color w:val="D86DCB" w:themeColor="accent5" w:themeTint="99"/>
+          <w:sz w:val="32"/>
+          <w:szCs w:val="32"/>
+        </w:rPr>
+      </w:pPr>
+      <w:r>
+        <w:rPr>
+          <w:rFonts w:cs="Carlito"/>
+          <w:b/>
+          <w:bCs/>
+          <w:color w:val="D86DCB" w:themeColor="accent5" w:themeTint="99"/>
+          <w:sz w:val="32"/>
+          <w:szCs w:val="32"/>
+        </w:rPr>
         <w:t>result = a @ b</w:t>
       </w:r>
     </w:p>
@@ -2936,49 +2935,49 @@
       <w:pPr>
         <w:jc w:val="both"/>
         <w:rPr>
-          <w:rFonts w:ascii="Carlito" w:hAnsi="Carlito" w:cs="Carlito"/>
-          <w:sz w:val="34"/>
-          <w:szCs w:val="34"/>
-        </w:rPr>
-      </w:pPr>
-    </w:p>
-    <w:p>
-      <w:pPr>
-        <w:jc w:val="both"/>
-        <w:rPr>
-          <w:rFonts w:ascii="Carlito" w:hAnsi="Carlito" w:cs="Carlito"/>
-          <w:sz w:val="34"/>
-          <w:szCs w:val="34"/>
-        </w:rPr>
-      </w:pPr>
-    </w:p>
-    <w:p>
-      <w:pPr>
-        <w:jc w:val="both"/>
-        <w:rPr>
-          <w:rFonts w:ascii="Carlito" w:hAnsi="Carlito" w:cs="Carlito"/>
-          <w:sz w:val="34"/>
-          <w:szCs w:val="34"/>
-        </w:rPr>
-      </w:pPr>
-    </w:p>
-    <w:p>
-      <w:pPr>
-        <w:jc w:val="both"/>
-        <w:rPr>
-          <w:rFonts w:ascii="Carlito" w:hAnsi="Carlito" w:cs="Carlito"/>
-          <w:sz w:val="34"/>
-          <w:szCs w:val="34"/>
-        </w:rPr>
-      </w:pPr>
-    </w:p>
-    <w:p>
-      <w:pPr>
-        <w:jc w:val="both"/>
-        <w:rPr>
-          <w:rFonts w:ascii="Carlito" w:hAnsi="Carlito" w:cs="Carlito"/>
-          <w:sz w:val="34"/>
-          <w:szCs w:val="34"/>
+          <w:rFonts w:cs="Carlito"/>
+          <w:sz w:val="32"/>
+          <w:szCs w:val="32"/>
+        </w:rPr>
+      </w:pPr>
+    </w:p>
+    <w:p>
+      <w:pPr>
+        <w:jc w:val="both"/>
+        <w:rPr>
+          <w:rFonts w:cs="Carlito"/>
+          <w:sz w:val="32"/>
+          <w:szCs w:val="32"/>
+        </w:rPr>
+      </w:pPr>
+    </w:p>
+    <w:p>
+      <w:pPr>
+        <w:jc w:val="both"/>
+        <w:rPr>
+          <w:rFonts w:cs="Carlito"/>
+          <w:sz w:val="32"/>
+          <w:szCs w:val="32"/>
+        </w:rPr>
+      </w:pPr>
+    </w:p>
+    <w:p>
+      <w:pPr>
+        <w:jc w:val="both"/>
+        <w:rPr>
+          <w:rFonts w:cs="Carlito"/>
+          <w:sz w:val="32"/>
+          <w:szCs w:val="32"/>
+        </w:rPr>
+      </w:pPr>
+    </w:p>
+    <w:p>
+      <w:pPr>
+        <w:jc w:val="both"/>
+        <w:rPr>
+          <w:rFonts w:cs="Carlito"/>
+          <w:sz w:val="32"/>
+          <w:szCs w:val="32"/>
         </w:rPr>
       </w:pPr>
     </w:p>

</xml_diff>